<commit_message>
Dokumentáción javításokat hajtottam végre
</commit_message>
<xml_diff>
--- a/docs/Dokumentáció.docx
+++ b/docs/Dokumentáció.docx
@@ -668,7 +668,7 @@
     </w:p>
     <w:sdt>
       <w:sdtPr>
-        <w:id w:val="-1457530553"/>
+        <w:id w:val="-332487444"/>
         <w:docPartObj>
           <w:docPartGallery w:val="Table of Contents"/>
           <w:docPartUnique w:val="1"/>
@@ -1157,6 +1157,13 @@
               <w:t xml:space="preserve">5</w:t>
             </w:r>
           </w:hyperlink>
+          <w:r>
+            <w:rPr>
+              <w:rFonts w:ascii="Arial" w:cs="Arial" w:eastAsia="Arial" w:hAnsi="Arial"/>
+              <w:rtl w:val="0"/>
+            </w:rPr>
+            <w:t xml:space="preserve">kosár</w:t>
+          </w:r>
           <w:r>
             <w:rPr>
               <w:rtl w:val="0"/>
@@ -3521,7 +3528,7 @@
               </w:rPr>
               <w:t xml:space="preserve">Mesterséges intelligencia használata a pályamunka elkészítése során</w:t>
               <w:tab/>
-              <w:t xml:space="preserve">17</w:t>
+              <w:t xml:space="preserve">18</w:t>
             </w:r>
           </w:hyperlink>
           <w:r>
@@ -3574,7 +3581,7 @@
               </w:rPr>
               <w:t xml:space="preserve">A projekt korábbi bemutatása</w:t>
               <w:tab/>
-              <w:t xml:space="preserve">17</w:t>
+              <w:t xml:space="preserve">18</w:t>
             </w:r>
           </w:hyperlink>
           <w:r>
@@ -3627,7 +3634,7 @@
               </w:rPr>
               <w:t xml:space="preserve">IRODALOMJEGYZÉK</w:t>
               <w:tab/>
-              <w:t xml:space="preserve">18</w:t>
+              <w:t xml:space="preserve">19</w:t>
             </w:r>
           </w:hyperlink>
           <w:r>
@@ -3680,7 +3687,7 @@
               </w:rPr>
               <w:t xml:space="preserve">MELLÉKLETEK</w:t>
               <w:tab/>
-              <w:t xml:space="preserve">19</w:t>
+              <w:t xml:space="preserve">20</w:t>
             </w:r>
           </w:hyperlink>
           <w:r>
@@ -3784,11 +3791,14 @@
       <w:bookmarkEnd w:id="1"/>
       <w:r>
         <w:rPr>
-          <w:sz w:val="24"/>
-          <w:szCs w:val="24"/>
           <w:rtl w:val="0"/>
         </w:rPr>
         <w:t xml:space="preserve">Tartalmi összefoglaló</w:t>
+      </w:r>
+      <w:r>
+        <w:rPr>
+          <w:rtl w:val="0"/>
+        </w:rPr>
       </w:r>
     </w:p>
     <w:p>
@@ -3968,7 +3978,7 @@
       <w:pPr>
         <w:numPr>
           <w:ilvl w:val="0"/>
-          <w:numId w:val="26"/>
+          <w:numId w:val="24"/>
         </w:numPr>
         <w:spacing w:after="60" w:before="120" w:line="276" w:lineRule="auto"/>
         <w:ind w:left="720" w:hanging="360"/>
@@ -4026,7 +4036,7 @@
         <w:widowControl w:val="1"/>
         <w:numPr>
           <w:ilvl w:val="0"/>
-          <w:numId w:val="26"/>
+          <w:numId w:val="24"/>
         </w:numPr>
         <w:pBdr>
           <w:top w:space="0" w:sz="0" w:val="nil"/>
@@ -4065,7 +4075,7 @@
         <w:widowControl w:val="1"/>
         <w:numPr>
           <w:ilvl w:val="0"/>
-          <w:numId w:val="26"/>
+          <w:numId w:val="24"/>
         </w:numPr>
         <w:pBdr>
           <w:top w:space="0" w:sz="0" w:val="nil"/>
@@ -4114,7 +4124,7 @@
         <w:widowControl w:val="1"/>
         <w:numPr>
           <w:ilvl w:val="0"/>
-          <w:numId w:val="26"/>
+          <w:numId w:val="24"/>
         </w:numPr>
         <w:pBdr>
           <w:top w:space="0" w:sz="0" w:val="nil"/>
@@ -4206,11 +4216,14 @@
       <w:bookmarkEnd w:id="2"/>
       <w:r>
         <w:rPr>
-          <w:sz w:val="24"/>
-          <w:szCs w:val="24"/>
           <w:rtl w:val="0"/>
         </w:rPr>
         <w:t xml:space="preserve">Motiváció</w:t>
+      </w:r>
+      <w:r>
+        <w:rPr>
+          <w:rtl w:val="0"/>
+        </w:rPr>
       </w:r>
     </w:p>
     <w:p>
@@ -4274,7 +4287,7 @@
       <w:pPr>
         <w:numPr>
           <w:ilvl w:val="0"/>
-          <w:numId w:val="17"/>
+          <w:numId w:val="16"/>
         </w:numPr>
         <w:spacing w:after="60" w:before="120" w:line="276" w:lineRule="auto"/>
         <w:ind w:left="360"/>
@@ -4299,7 +4312,7 @@
       <w:pPr>
         <w:numPr>
           <w:ilvl w:val="0"/>
-          <w:numId w:val="17"/>
+          <w:numId w:val="16"/>
         </w:numPr>
         <w:spacing w:after="60" w:before="120" w:line="276" w:lineRule="auto"/>
         <w:ind w:left="360"/>
@@ -4324,7 +4337,7 @@
       <w:pPr>
         <w:numPr>
           <w:ilvl w:val="0"/>
-          <w:numId w:val="17"/>
+          <w:numId w:val="16"/>
         </w:numPr>
         <w:spacing w:after="60" w:before="120" w:line="276" w:lineRule="auto"/>
         <w:ind w:left="360"/>
@@ -4349,7 +4362,7 @@
       <w:pPr>
         <w:numPr>
           <w:ilvl w:val="0"/>
-          <w:numId w:val="17"/>
+          <w:numId w:val="16"/>
         </w:numPr>
         <w:spacing w:after="60" w:before="120" w:line="276" w:lineRule="auto"/>
         <w:ind w:left="360"/>
@@ -4374,7 +4387,7 @@
       <w:pPr>
         <w:numPr>
           <w:ilvl w:val="0"/>
-          <w:numId w:val="17"/>
+          <w:numId w:val="16"/>
         </w:numPr>
         <w:spacing w:after="60" w:before="120" w:line="276" w:lineRule="auto"/>
         <w:ind w:left="360"/>
@@ -4438,11 +4451,16 @@
       <w:bookmarkEnd w:id="3"/>
       <w:r>
         <w:rPr>
-          <w:sz w:val="24"/>
-          <w:szCs w:val="24"/>
+          <w:sz w:val="32"/>
+          <w:szCs w:val="32"/>
           <w:rtl w:val="0"/>
         </w:rPr>
         <w:t xml:space="preserve">Létező, hasonló megoldások bemutatása</w:t>
+      </w:r>
+      <w:r>
+        <w:rPr>
+          <w:rtl w:val="0"/>
+        </w:rPr>
       </w:r>
     </w:p>
     <w:p>
@@ -4511,7 +4529,7 @@
       <w:pPr>
         <w:numPr>
           <w:ilvl w:val="0"/>
-          <w:numId w:val="18"/>
+          <w:numId w:val="17"/>
         </w:numPr>
         <w:spacing w:after="60" w:before="120" w:line="276" w:lineRule="auto"/>
         <w:ind w:left="720" w:hanging="360"/>
@@ -4546,7 +4564,7 @@
       <w:pPr>
         <w:numPr>
           <w:ilvl w:val="0"/>
-          <w:numId w:val="18"/>
+          <w:numId w:val="17"/>
         </w:numPr>
         <w:spacing w:after="60" w:before="120" w:line="276" w:lineRule="auto"/>
         <w:ind w:left="720" w:hanging="360"/>
@@ -4581,7 +4599,7 @@
       <w:pPr>
         <w:numPr>
           <w:ilvl w:val="0"/>
-          <w:numId w:val="18"/>
+          <w:numId w:val="17"/>
         </w:numPr>
         <w:spacing w:after="60" w:before="120" w:line="276" w:lineRule="auto"/>
         <w:ind w:left="720" w:hanging="360"/>
@@ -4620,7 +4638,7 @@
         <w:widowControl w:val="1"/>
         <w:numPr>
           <w:ilvl w:val="0"/>
-          <w:numId w:val="18"/>
+          <w:numId w:val="17"/>
         </w:numPr>
         <w:pBdr>
           <w:top w:space="0" w:sz="0" w:val="nil"/>
@@ -4670,7 +4688,7 @@
         <w:widowControl w:val="1"/>
         <w:numPr>
           <w:ilvl w:val="0"/>
-          <w:numId w:val="18"/>
+          <w:numId w:val="17"/>
         </w:numPr>
         <w:pBdr>
           <w:top w:space="0" w:sz="0" w:val="nil"/>
@@ -6119,7 +6137,7 @@
       <w:pPr>
         <w:numPr>
           <w:ilvl w:val="0"/>
-          <w:numId w:val="30"/>
+          <w:numId w:val="28"/>
         </w:numPr>
         <w:spacing w:after="60" w:before="120" w:line="276" w:lineRule="auto"/>
         <w:ind w:left="720" w:hanging="360"/>
@@ -6144,7 +6162,7 @@
       <w:pPr>
         <w:numPr>
           <w:ilvl w:val="0"/>
-          <w:numId w:val="30"/>
+          <w:numId w:val="28"/>
         </w:numPr>
         <w:spacing w:after="60" w:before="120" w:line="276" w:lineRule="auto"/>
         <w:ind w:left="720" w:hanging="360"/>
@@ -6169,7 +6187,7 @@
       <w:pPr>
         <w:numPr>
           <w:ilvl w:val="0"/>
-          <w:numId w:val="30"/>
+          <w:numId w:val="28"/>
         </w:numPr>
         <w:spacing w:after="60" w:before="120" w:line="276" w:lineRule="auto"/>
         <w:ind w:left="720" w:hanging="360"/>
@@ -6194,7 +6212,7 @@
       <w:pPr>
         <w:numPr>
           <w:ilvl w:val="0"/>
-          <w:numId w:val="30"/>
+          <w:numId w:val="28"/>
         </w:numPr>
         <w:spacing w:after="60" w:before="120" w:line="276" w:lineRule="auto"/>
         <w:ind w:left="720" w:hanging="360"/>
@@ -6219,7 +6237,7 @@
       <w:pPr>
         <w:numPr>
           <w:ilvl w:val="0"/>
-          <w:numId w:val="30"/>
+          <w:numId w:val="28"/>
         </w:numPr>
         <w:spacing w:after="60" w:before="120" w:line="276" w:lineRule="auto"/>
         <w:ind w:left="720" w:hanging="360"/>
@@ -6244,7 +6262,7 @@
       <w:pPr>
         <w:numPr>
           <w:ilvl w:val="0"/>
-          <w:numId w:val="30"/>
+          <w:numId w:val="28"/>
         </w:numPr>
         <w:spacing w:after="60" w:before="120" w:line="276" w:lineRule="auto"/>
         <w:ind w:left="720" w:hanging="360"/>
@@ -6269,7 +6287,7 @@
       <w:pPr>
         <w:numPr>
           <w:ilvl w:val="0"/>
-          <w:numId w:val="30"/>
+          <w:numId w:val="28"/>
         </w:numPr>
         <w:spacing w:after="60" w:before="120" w:line="276" w:lineRule="auto"/>
         <w:ind w:left="720" w:hanging="360"/>
@@ -6398,7 +6416,7 @@
       <w:pPr>
         <w:numPr>
           <w:ilvl w:val="0"/>
-          <w:numId w:val="20"/>
+          <w:numId w:val="18"/>
         </w:numPr>
         <w:spacing w:after="60" w:before="120" w:line="276" w:lineRule="auto"/>
         <w:ind w:left="720" w:hanging="360"/>
@@ -6423,7 +6441,7 @@
       <w:pPr>
         <w:numPr>
           <w:ilvl w:val="0"/>
-          <w:numId w:val="20"/>
+          <w:numId w:val="18"/>
         </w:numPr>
         <w:spacing w:after="60" w:before="120" w:line="276" w:lineRule="auto"/>
         <w:ind w:left="720" w:hanging="360"/>
@@ -6448,7 +6466,7 @@
       <w:pPr>
         <w:numPr>
           <w:ilvl w:val="0"/>
-          <w:numId w:val="20"/>
+          <w:numId w:val="18"/>
         </w:numPr>
         <w:spacing w:after="60" w:before="120" w:line="276" w:lineRule="auto"/>
         <w:ind w:left="720" w:hanging="360"/>
@@ -6473,7 +6491,7 @@
       <w:pPr>
         <w:numPr>
           <w:ilvl w:val="0"/>
-          <w:numId w:val="20"/>
+          <w:numId w:val="18"/>
         </w:numPr>
         <w:spacing w:after="60" w:before="120" w:line="276" w:lineRule="auto"/>
         <w:ind w:left="720" w:hanging="360"/>
@@ -6498,7 +6516,7 @@
       <w:pPr>
         <w:numPr>
           <w:ilvl w:val="0"/>
-          <w:numId w:val="20"/>
+          <w:numId w:val="18"/>
         </w:numPr>
         <w:spacing w:after="60" w:before="120" w:line="276" w:lineRule="auto"/>
         <w:ind w:left="720" w:hanging="360"/>
@@ -6627,7 +6645,7 @@
       <w:pPr>
         <w:numPr>
           <w:ilvl w:val="0"/>
-          <w:numId w:val="29"/>
+          <w:numId w:val="27"/>
         </w:numPr>
         <w:spacing w:after="60" w:before="120" w:line="276" w:lineRule="auto"/>
         <w:ind w:left="720" w:hanging="360"/>
@@ -6652,7 +6670,7 @@
       <w:pPr>
         <w:numPr>
           <w:ilvl w:val="0"/>
-          <w:numId w:val="29"/>
+          <w:numId w:val="27"/>
         </w:numPr>
         <w:spacing w:after="60" w:before="120" w:line="276" w:lineRule="auto"/>
         <w:ind w:left="720" w:hanging="360"/>
@@ -6677,7 +6695,7 @@
       <w:pPr>
         <w:numPr>
           <w:ilvl w:val="0"/>
-          <w:numId w:val="29"/>
+          <w:numId w:val="27"/>
         </w:numPr>
         <w:spacing w:after="60" w:before="120" w:line="276" w:lineRule="auto"/>
         <w:ind w:left="720" w:hanging="360"/>
@@ -6702,7 +6720,7 @@
       <w:pPr>
         <w:numPr>
           <w:ilvl w:val="0"/>
-          <w:numId w:val="29"/>
+          <w:numId w:val="27"/>
         </w:numPr>
         <w:spacing w:after="60" w:before="120" w:line="276" w:lineRule="auto"/>
         <w:ind w:left="720" w:hanging="360"/>
@@ -7566,18 +7584,23 @@
       <w:bookmarkEnd w:id="14"/>
       <w:r>
         <w:rPr>
-          <w:sz w:val="24"/>
-          <w:szCs w:val="24"/>
+          <w:sz w:val="32"/>
+          <w:szCs w:val="32"/>
           <w:rtl w:val="0"/>
         </w:rPr>
         <w:t xml:space="preserve">A mi szoftverünk előnyei a továbbiakhoz képest</w:t>
+      </w:r>
+      <w:r>
+        <w:rPr>
+          <w:rtl w:val="0"/>
+        </w:rPr>
       </w:r>
     </w:p>
     <w:p>
       <w:pPr>
         <w:numPr>
           <w:ilvl w:val="0"/>
-          <w:numId w:val="21"/>
+          <w:numId w:val="19"/>
         </w:numPr>
         <w:spacing w:after="60" w:before="120" w:line="276" w:lineRule="auto"/>
         <w:ind w:left="720" w:hanging="360"/>
@@ -7602,7 +7625,7 @@
       <w:pPr>
         <w:numPr>
           <w:ilvl w:val="0"/>
-          <w:numId w:val="21"/>
+          <w:numId w:val="19"/>
         </w:numPr>
         <w:spacing w:after="60" w:before="120" w:line="276" w:lineRule="auto"/>
         <w:ind w:left="720" w:hanging="360"/>
@@ -7627,7 +7650,7 @@
       <w:pPr>
         <w:numPr>
           <w:ilvl w:val="0"/>
-          <w:numId w:val="21"/>
+          <w:numId w:val="19"/>
         </w:numPr>
         <w:spacing w:after="60" w:before="120" w:line="276" w:lineRule="auto"/>
         <w:ind w:left="720" w:hanging="360"/>
@@ -7652,7 +7675,7 @@
       <w:pPr>
         <w:numPr>
           <w:ilvl w:val="0"/>
-          <w:numId w:val="21"/>
+          <w:numId w:val="19"/>
         </w:numPr>
         <w:spacing w:after="60" w:before="120" w:line="276" w:lineRule="auto"/>
         <w:ind w:left="720" w:hanging="360"/>
@@ -7677,7 +7700,7 @@
       <w:pPr>
         <w:numPr>
           <w:ilvl w:val="0"/>
-          <w:numId w:val="21"/>
+          <w:numId w:val="19"/>
         </w:numPr>
         <w:spacing w:after="60" w:before="120" w:line="276" w:lineRule="auto"/>
         <w:ind w:left="720" w:hanging="360"/>
@@ -7762,8 +7785,6 @@
       <w:bookmarkEnd w:id="16"/>
       <w:r>
         <w:rPr>
-          <w:sz w:val="24"/>
-          <w:szCs w:val="24"/>
           <w:rtl w:val="0"/>
         </w:rPr>
         <w:t xml:space="preserve">Használati útmutató és rendszerdokumentáció (kivonat)</w:t>
@@ -7954,28 +7975,88 @@
     </w:p>
     <w:p>
       <w:pPr>
-        <w:spacing w:after="60" w:before="120" w:line="276" w:lineRule="auto"/>
-        <w:rPr>
-          <w:rFonts w:ascii="Times New Roman" w:cs="Times New Roman" w:eastAsia="Times New Roman" w:hAnsi="Times New Roman"/>
-          <w:sz w:val="24"/>
-          <w:szCs w:val="24"/>
-        </w:rPr>
-      </w:pPr>
-      <w:r>
-        <w:rPr>
-          <w:rFonts w:ascii="Times New Roman" w:cs="Times New Roman" w:eastAsia="Times New Roman" w:hAnsi="Times New Roman"/>
-          <w:b w:val="1"/>
-          <w:bCs w:val="1"/>
-          <w:sz w:val="24"/>
-          <w:szCs w:val="24"/>
-          <w:rtl w:val="0"/>
-        </w:rPr>
-        <w:t xml:space="preserve">1. Mobilalkalmazás </w:t>
-      </w:r>
-      <w:r>
-        <w:rPr>
-          <w:rtl w:val="0"/>
-        </w:rPr>
+        <w:pStyle w:val="Heading2"/>
+        <w:spacing w:after="60" w:before="120" w:line="276" w:lineRule="auto"/>
+        <w:rPr/>
+      </w:pPr>
+      <w:bookmarkStart w:colFirst="0" w:colLast="0" w:name="_heading=h.f3icj25c7alj" w:id="17"/>
+      <w:bookmarkEnd w:id="17"/>
+      <w:r>
+        <w:rPr>
+          <w:sz w:val="24"/>
+          <w:szCs w:val="24"/>
+          <w:rtl w:val="0"/>
+        </w:rPr>
+        <w:t xml:space="preserve">1. </w:t>
+      </w:r>
+      <w:r>
+        <w:rPr>
+          <w:smallCaps w:val="1"/>
+          <w:rtl w:val="0"/>
+        </w:rPr>
+        <w:t xml:space="preserve">Mobilalkalmazás </w:t>
+      </w:r>
+      <w:r>
+        <w:rPr>
+          <w:rtl w:val="0"/>
+        </w:rPr>
+      </w:r>
+    </w:p>
+    <w:p>
+      <w:pPr>
+        <w:pStyle w:val="Heading3"/>
+        <w:keepNext w:val="0"/>
+        <w:keepLines w:val="0"/>
+        <w:spacing w:line="276" w:lineRule="auto"/>
+        <w:ind w:left="720" w:hanging="360"/>
+        <w:jc w:val="both"/>
+        <w:rPr/>
+      </w:pPr>
+      <w:bookmarkStart w:colFirst="0" w:colLast="0" w:name="_heading=h.etli4tw9bgv1" w:id="18"/>
+      <w:bookmarkEnd w:id="18"/>
+      <w:r>
+        <w:rPr>
+          <w:rtl w:val="0"/>
+        </w:rPr>
+        <w:t xml:space="preserve">Áttekintés</w:t>
+      </w:r>
+    </w:p>
+    <w:p>
+      <w:pPr>
+        <w:spacing w:after="60" w:before="120" w:line="276" w:lineRule="auto"/>
+        <w:rPr>
+          <w:rFonts w:ascii="Times New Roman" w:cs="Times New Roman" w:eastAsia="Times New Roman" w:hAnsi="Times New Roman"/>
+          <w:sz w:val="24"/>
+          <w:szCs w:val="24"/>
+        </w:rPr>
+      </w:pPr>
+      <w:r>
+        <w:rPr>
+          <w:rFonts w:ascii="Times New Roman" w:cs="Times New Roman" w:eastAsia="Times New Roman" w:hAnsi="Times New Roman"/>
+          <w:sz w:val="24"/>
+          <w:szCs w:val="24"/>
+          <w:rtl w:val="0"/>
+        </w:rPr>
+        <w:t xml:space="preserve">A mobilalkalmazás célja, hogy a végfelhasználók számára gyors és kényelmes hozzáférést biztosítson a szolgáltatásokhoz mobil eszközökön keresztül. Az alkalmazás fejlesztői és demonstrációs környezetben futtatható, valamint az Expo Go alkalmazással tesztelhető.</w:t>
+      </w:r>
+    </w:p>
+    <w:p>
+      <w:pPr>
+        <w:spacing w:after="60" w:before="120" w:line="276" w:lineRule="auto"/>
+        <w:rPr>
+          <w:rFonts w:ascii="Times New Roman" w:cs="Times New Roman" w:eastAsia="Times New Roman" w:hAnsi="Times New Roman"/>
+          <w:sz w:val="24"/>
+          <w:szCs w:val="24"/>
+        </w:rPr>
+      </w:pPr>
+      <w:r>
+        <w:rPr>
+          <w:rFonts w:ascii="Times New Roman" w:cs="Times New Roman" w:eastAsia="Times New Roman" w:hAnsi="Times New Roman"/>
+          <w:sz w:val="24"/>
+          <w:szCs w:val="24"/>
+          <w:rtl w:val="0"/>
+        </w:rPr>
+        <w:t xml:space="preserve">A felület kialakítása modern, dinamikus és reszponzív, amely biztosítja a magas szintű felhasználói élményt különböző képernyőméreteken is.</w:t>
       </w:r>
     </w:p>
     <w:p>
@@ -7992,85 +8073,42 @@
           <w:szCs w:val="24"/>
         </w:rPr>
       </w:pPr>
-      <w:bookmarkStart w:colFirst="0" w:colLast="0" w:name="_heading=h.etli4tw9bgv1" w:id="17"/>
-      <w:bookmarkEnd w:id="17"/>
-      <w:r>
-        <w:rPr>
+      <w:bookmarkStart w:colFirst="0" w:colLast="0" w:name="_heading=h.fug2eos4tse0" w:id="19"/>
+      <w:bookmarkEnd w:id="19"/>
+      <w:r>
+        <w:rPr>
+          <w:b w:val="0"/>
+          <w:bCs w:val="0"/>
           <w:smallCaps w:val="0"/>
           <w:sz w:val="24"/>
           <w:szCs w:val="24"/>
           <w:rtl w:val="0"/>
         </w:rPr>
-        <w:t xml:space="preserve">Áttekintés</w:t>
-      </w:r>
-    </w:p>
-    <w:p>
-      <w:pPr>
-        <w:spacing w:after="60" w:before="120" w:line="276" w:lineRule="auto"/>
-        <w:rPr>
-          <w:rFonts w:ascii="Times New Roman" w:cs="Times New Roman" w:eastAsia="Times New Roman" w:hAnsi="Times New Roman"/>
-          <w:sz w:val="24"/>
-          <w:szCs w:val="24"/>
-        </w:rPr>
-      </w:pPr>
-      <w:r>
-        <w:rPr>
-          <w:rFonts w:ascii="Times New Roman" w:cs="Times New Roman" w:eastAsia="Times New Roman" w:hAnsi="Times New Roman"/>
-          <w:sz w:val="24"/>
-          <w:szCs w:val="24"/>
-          <w:rtl w:val="0"/>
-        </w:rPr>
-        <w:t xml:space="preserve">A mobilalkalmazás célja, hogy a végfelhasználók számára gyors és kényelmes hozzáférést biztosítson a szolgáltatásokhoz mobil eszközökön keresztül. Az alkalmazás fejlesztői és demonstrációs környezetben futtatható, valamint az Expo Go alkalmazással tesztelhető.</w:t>
-      </w:r>
-    </w:p>
-    <w:p>
-      <w:pPr>
-        <w:spacing w:after="60" w:before="120" w:line="276" w:lineRule="auto"/>
-        <w:rPr>
-          <w:rFonts w:ascii="Times New Roman" w:cs="Times New Roman" w:eastAsia="Times New Roman" w:hAnsi="Times New Roman"/>
-          <w:sz w:val="24"/>
-          <w:szCs w:val="24"/>
-        </w:rPr>
-      </w:pPr>
-      <w:r>
-        <w:rPr>
-          <w:rFonts w:ascii="Times New Roman" w:cs="Times New Roman" w:eastAsia="Times New Roman" w:hAnsi="Times New Roman"/>
-          <w:sz w:val="24"/>
-          <w:szCs w:val="24"/>
-          <w:rtl w:val="0"/>
-        </w:rPr>
-        <w:t xml:space="preserve">A felület kialakítása modern, dinamikus és reszponzív, amely biztosítja a magas szintű felhasználói élményt különböző képernyőméreteken is.</w:t>
-      </w:r>
-    </w:p>
-    <w:p>
-      <w:pPr>
-        <w:pStyle w:val="Heading2"/>
+        <w:t xml:space="preserve">Technológiai háttér</w:t>
+      </w:r>
+      <w:r>
+        <w:rPr>
+          <w:rtl w:val="0"/>
+        </w:rPr>
+      </w:r>
+    </w:p>
+    <w:p>
+      <w:pPr>
         <w:keepNext w:val="0"/>
         <w:keepLines w:val="0"/>
-        <w:spacing w:after="60" w:before="120" w:line="276" w:lineRule="auto"/>
-        <w:ind w:left="720" w:hanging="360"/>
+        <w:pageBreakBefore w:val="0"/>
+        <w:widowControl w:val="1"/>
+        <w:pBdr>
+          <w:top w:space="0" w:sz="0" w:val="nil"/>
+          <w:left w:space="0" w:sz="0" w:val="nil"/>
+          <w:bottom w:space="0" w:sz="0" w:val="nil"/>
+          <w:right w:space="0" w:sz="0" w:val="nil"/>
+          <w:between w:space="0" w:sz="0" w:val="nil"/>
+        </w:pBdr>
+        <w:shd w:fill="auto" w:val="clear"/>
+        <w:spacing w:after="60" w:before="120" w:line="276" w:lineRule="auto"/>
+        <w:ind w:left="0" w:right="0" w:firstLine="0"/>
         <w:jc w:val="both"/>
-        <w:rPr>
-          <w:smallCaps w:val="0"/>
-          <w:sz w:val="24"/>
-          <w:szCs w:val="24"/>
-        </w:rPr>
-      </w:pPr>
-      <w:bookmarkStart w:colFirst="0" w:colLast="0" w:name="_heading=h.fug2eos4tse0" w:id="18"/>
-      <w:bookmarkEnd w:id="18"/>
-      <w:r>
-        <w:rPr>
-          <w:smallCaps w:val="0"/>
-          <w:sz w:val="24"/>
-          <w:szCs w:val="24"/>
-          <w:rtl w:val="0"/>
-        </w:rPr>
-        <w:t xml:space="preserve">Technológiai háttér</w:t>
-      </w:r>
-    </w:p>
-    <w:p>
-      <w:pPr>
-        <w:spacing w:after="60" w:before="120" w:line="276" w:lineRule="auto"/>
         <w:rPr>
           <w:rFonts w:ascii="Times New Roman" w:cs="Times New Roman" w:eastAsia="Times New Roman" w:hAnsi="Times New Roman"/>
           <w:sz w:val="24"/>
@@ -8125,6 +8163,43 @@
           <w:rtl w:val="0"/>
         </w:rPr>
         <w:t xml:space="preserve">mobilalkalmazás-fejlesztő keretrendszer 54-es verzióját használja a visszafelé kompatibilitás végett.</w:t>
+      </w:r>
+    </w:p>
+    <w:p>
+      <w:pPr>
+        <w:keepNext w:val="0"/>
+        <w:keepLines w:val="0"/>
+        <w:pageBreakBefore w:val="0"/>
+        <w:widowControl w:val="1"/>
+        <w:pBdr>
+          <w:top w:space="0" w:sz="0" w:val="nil"/>
+          <w:left w:space="0" w:sz="0" w:val="nil"/>
+          <w:bottom w:space="0" w:sz="0" w:val="nil"/>
+          <w:right w:space="0" w:sz="0" w:val="nil"/>
+          <w:between w:space="0" w:sz="0" w:val="nil"/>
+        </w:pBdr>
+        <w:shd w:fill="auto" w:val="clear"/>
+        <w:spacing w:after="60" w:before="120" w:line="276" w:lineRule="auto"/>
+        <w:ind w:left="0" w:right="0" w:firstLine="0"/>
+        <w:jc w:val="both"/>
+        <w:rPr>
+          <w:b w:val="1"/>
+          <w:bCs w:val="1"/>
+        </w:rPr>
+      </w:pPr>
+      <w:r>
+        <w:rPr>
+          <w:rFonts w:ascii="Times New Roman" w:cs="Times New Roman" w:eastAsia="Times New Roman" w:hAnsi="Times New Roman"/>
+          <w:sz w:val="24"/>
+          <w:szCs w:val="24"/>
+          <w:rtl w:val="0"/>
+        </w:rPr>
+        <w:t xml:space="preserve">Az Expo által támogatott platformok az Android, iOS és a web, fejlesztői környezetben ezeken lehet natívan futtatni és tesztelni az alkalmazást. </w:t>
+      </w:r>
+      <w:r>
+        <w:rPr>
+          <w:rtl w:val="0"/>
+        </w:rPr>
       </w:r>
     </w:p>
     <w:p>
@@ -8135,152 +8210,52 @@
         <w:spacing w:after="60" w:before="120" w:line="276" w:lineRule="auto"/>
         <w:ind w:firstLine="360"/>
         <w:jc w:val="both"/>
-        <w:rPr>
-          <w:b w:val="1"/>
-          <w:bCs w:val="1"/>
-        </w:rPr>
-      </w:pPr>
-      <w:bookmarkStart w:colFirst="0" w:colLast="0" w:name="_heading=h.3fetxadfc8cr" w:id="19"/>
-      <w:bookmarkEnd w:id="19"/>
-      <w:r>
-        <w:rPr>
-          <w:b w:val="1"/>
-          <w:bCs w:val="1"/>
-          <w:rtl w:val="0"/>
-        </w:rPr>
-        <w:t xml:space="preserve">Támogatott platformok</w:t>
-      </w:r>
-    </w:p>
-    <w:p>
-      <w:pPr>
-        <w:numPr>
-          <w:ilvl w:val="0"/>
-          <w:numId w:val="14"/>
-        </w:numPr>
-        <w:spacing w:after="60" w:before="120" w:line="276" w:lineRule="auto"/>
-        <w:ind w:left="720" w:hanging="360"/>
-        <w:jc w:val="left"/>
-        <w:rPr>
-          <w:rFonts w:ascii="Times New Roman" w:cs="Times New Roman" w:eastAsia="Times New Roman" w:hAnsi="Times New Roman"/>
-          <w:sz w:val="24"/>
-          <w:szCs w:val="24"/>
-        </w:rPr>
-      </w:pPr>
-      <w:r>
-        <w:rPr>
-          <w:rFonts w:ascii="Times New Roman" w:cs="Times New Roman" w:eastAsia="Times New Roman" w:hAnsi="Times New Roman"/>
-          <w:sz w:val="24"/>
-          <w:szCs w:val="24"/>
-          <w:rtl w:val="0"/>
-        </w:rPr>
-        <w:t xml:space="preserve">Android</w:t>
-      </w:r>
-    </w:p>
-    <w:p>
-      <w:pPr>
-        <w:numPr>
-          <w:ilvl w:val="0"/>
-          <w:numId w:val="14"/>
-        </w:numPr>
-        <w:spacing w:after="60" w:before="120" w:line="276" w:lineRule="auto"/>
-        <w:ind w:left="720" w:hanging="360"/>
-        <w:jc w:val="left"/>
-        <w:rPr>
-          <w:rFonts w:ascii="Times New Roman" w:cs="Times New Roman" w:eastAsia="Times New Roman" w:hAnsi="Times New Roman"/>
-          <w:sz w:val="24"/>
-          <w:szCs w:val="24"/>
-        </w:rPr>
-      </w:pPr>
-      <w:r>
-        <w:rPr>
-          <w:rFonts w:ascii="Times New Roman" w:cs="Times New Roman" w:eastAsia="Times New Roman" w:hAnsi="Times New Roman"/>
-          <w:sz w:val="24"/>
-          <w:szCs w:val="24"/>
-          <w:rtl w:val="0"/>
-        </w:rPr>
-        <w:t xml:space="preserve">iOS</w:t>
-      </w:r>
-    </w:p>
-    <w:p>
-      <w:pPr>
-        <w:numPr>
-          <w:ilvl w:val="0"/>
-          <w:numId w:val="14"/>
-        </w:numPr>
-        <w:spacing w:after="60" w:before="120" w:line="276" w:lineRule="auto"/>
-        <w:ind w:left="720" w:hanging="360"/>
-        <w:jc w:val="left"/>
-        <w:rPr>
-          <w:rFonts w:ascii="Times New Roman" w:cs="Times New Roman" w:eastAsia="Times New Roman" w:hAnsi="Times New Roman"/>
-          <w:sz w:val="24"/>
-          <w:szCs w:val="24"/>
-        </w:rPr>
-      </w:pPr>
-      <w:r>
-        <w:rPr>
-          <w:rFonts w:ascii="Times New Roman" w:cs="Times New Roman" w:eastAsia="Times New Roman" w:hAnsi="Times New Roman"/>
-          <w:sz w:val="24"/>
-          <w:szCs w:val="24"/>
-          <w:rtl w:val="0"/>
-        </w:rPr>
-        <w:t xml:space="preserve">Web</w:t>
-      </w:r>
-    </w:p>
-    <w:p>
-      <w:pPr>
-        <w:pStyle w:val="Heading3"/>
+        <w:rPr/>
+      </w:pPr>
+      <w:bookmarkStart w:colFirst="0" w:colLast="0" w:name="_heading=h.i0l3zpwbu3hl" w:id="20"/>
+      <w:bookmarkEnd w:id="20"/>
+      <w:r>
+        <w:rPr>
+          <w:rtl w:val="0"/>
+        </w:rPr>
+        <w:t xml:space="preserve">Tesztelés</w:t>
+      </w:r>
+    </w:p>
+    <w:p>
+      <w:pPr>
         <w:keepNext w:val="0"/>
         <w:keepLines w:val="0"/>
-        <w:spacing w:after="60" w:before="120" w:line="276" w:lineRule="auto"/>
-        <w:ind w:firstLine="360"/>
+        <w:pageBreakBefore w:val="0"/>
+        <w:widowControl w:val="1"/>
+        <w:pBdr>
+          <w:top w:space="0" w:sz="0" w:val="nil"/>
+          <w:left w:space="0" w:sz="0" w:val="nil"/>
+          <w:bottom w:space="0" w:sz="0" w:val="nil"/>
+          <w:right w:space="0" w:sz="0" w:val="nil"/>
+          <w:between w:space="0" w:sz="0" w:val="nil"/>
+        </w:pBdr>
+        <w:shd w:fill="auto" w:val="clear"/>
+        <w:spacing w:after="60" w:before="120" w:line="276" w:lineRule="auto"/>
+        <w:ind w:left="0" w:right="0" w:firstLine="0"/>
         <w:jc w:val="both"/>
         <w:rPr>
-          <w:b w:val="1"/>
-          <w:bCs w:val="1"/>
-        </w:rPr>
-      </w:pPr>
-      <w:bookmarkStart w:colFirst="0" w:colLast="0" w:name="_heading=h.ahxte17t1fbl" w:id="20"/>
-      <w:bookmarkEnd w:id="20"/>
-      <w:r>
-        <w:rPr>
-          <w:b w:val="1"/>
-          <w:bCs w:val="1"/>
-          <w:rtl w:val="0"/>
-        </w:rPr>
-        <w:t xml:space="preserve">Futtatás fejlesztői környezetben</w:t>
-      </w:r>
-    </w:p>
-    <w:p>
-      <w:pPr>
-        <w:spacing w:after="60" w:before="120" w:line="276" w:lineRule="auto"/>
-        <w:rPr>
-          <w:rFonts w:ascii="Times New Roman" w:cs="Times New Roman" w:eastAsia="Times New Roman" w:hAnsi="Times New Roman"/>
-          <w:sz w:val="24"/>
-          <w:szCs w:val="24"/>
-        </w:rPr>
-      </w:pPr>
-      <w:r>
-        <w:rPr>
-          <w:rFonts w:ascii="Times New Roman" w:cs="Times New Roman" w:eastAsia="Times New Roman" w:hAnsi="Times New Roman"/>
-          <w:sz w:val="24"/>
-          <w:szCs w:val="24"/>
-          <w:rtl w:val="0"/>
-        </w:rPr>
-        <w:t xml:space="preserve">Az első lépés az Expo telepítése az </w:t>
-      </w:r>
-      <w:r>
-        <w:rPr>
-          <w:rFonts w:ascii="Times New Roman" w:cs="Times New Roman" w:eastAsia="Times New Roman" w:hAnsi="Times New Roman"/>
-          <w:sz w:val="24"/>
-          <w:szCs w:val="24"/>
-          <w:rtl w:val="0"/>
-        </w:rPr>
-        <w:t xml:space="preserve">npm install expo</w:t>
-      </w:r>
-      <w:r>
-        <w:rPr>
-          <w:rFonts w:ascii="Times New Roman" w:cs="Times New Roman" w:eastAsia="Times New Roman" w:hAnsi="Times New Roman"/>
-          <w:color w:val="188038"/>
+          <w:rFonts w:ascii="Times New Roman" w:cs="Times New Roman" w:eastAsia="Times New Roman" w:hAnsi="Times New Roman"/>
+          <w:sz w:val="24"/>
+          <w:szCs w:val="24"/>
+        </w:rPr>
+      </w:pPr>
+      <w:r>
+        <w:rPr>
+          <w:rFonts w:ascii="Times New Roman" w:cs="Times New Roman" w:eastAsia="Times New Roman" w:hAnsi="Times New Roman"/>
+          <w:sz w:val="24"/>
+          <w:szCs w:val="24"/>
+          <w:rtl w:val="0"/>
+        </w:rPr>
+        <w:t xml:space="preserve">Az első lépés az Expo telepítése az npm install expo</w:t>
+      </w:r>
+      <w:r>
+        <w:rPr>
+          <w:rFonts w:ascii="Times New Roman" w:cs="Times New Roman" w:eastAsia="Times New Roman" w:hAnsi="Times New Roman"/>
           <w:sz w:val="24"/>
           <w:szCs w:val="24"/>
           <w:rtl w:val="0"/>
@@ -8295,11 +8270,6 @@
           <w:rtl w:val="0"/>
         </w:rPr>
         <w:t xml:space="preserve">paranccsal.</w:t>
-      </w:r>
-      <w:r>
-        <w:rPr>
-          <w:rtl w:val="0"/>
-        </w:rPr>
       </w:r>
     </w:p>
     <w:p>
@@ -8325,8 +8295,6 @@
       <w:r>
         <w:rPr>
           <w:rFonts w:ascii="Times New Roman" w:cs="Times New Roman" w:eastAsia="Times New Roman" w:hAnsi="Times New Roman"/>
-          <w:b w:val="1"/>
-          <w:bCs w:val="1"/>
           <w:i w:val="0"/>
           <w:iCs w:val="0"/>
           <w:color w:val="000000"/>
@@ -8336,6 +8304,11 @@
         </w:rPr>
         <w:t xml:space="preserve">Indítási parancsok</w:t>
       </w:r>
+      <w:r>
+        <w:rPr>
+          <w:rtl w:val="0"/>
+        </w:rPr>
+      </w:r>
     </w:p>
     <w:p>
       <w:pPr>
@@ -8349,13 +8322,18 @@
       </w:pPr>
       <w:r>
         <w:rPr>
-          <w:rFonts w:ascii="Times New Roman" w:cs="Times New Roman" w:eastAsia="Times New Roman" w:hAnsi="Times New Roman"/>
+          <w:rFonts w:ascii="Courier New" w:cs="Courier New" w:eastAsia="Courier New" w:hAnsi="Courier New"/>
           <w:sz w:val="24"/>
           <w:szCs w:val="24"/>
           <w:rtl w:val="0"/>
         </w:rPr>
         <w:t xml:space="preserve">npx expo start</w:t>
       </w:r>
+      <w:r>
+        <w:rPr>
+          <w:rtl w:val="0"/>
+        </w:rPr>
+      </w:r>
     </w:p>
     <w:p>
       <w:pPr>
@@ -8381,53 +8359,32 @@
         <w:spacing w:after="60" w:before="120" w:line="276" w:lineRule="auto"/>
         <w:ind w:left="720" w:hanging="360"/>
         <w:rPr>
-          <w:rFonts w:ascii="Times New Roman" w:cs="Times New Roman" w:eastAsia="Times New Roman" w:hAnsi="Times New Roman"/>
-          <w:sz w:val="24"/>
-          <w:szCs w:val="24"/>
-        </w:rPr>
-      </w:pPr>
-      <w:r>
-        <w:rPr>
-          <w:rFonts w:ascii="Times New Roman" w:cs="Times New Roman" w:eastAsia="Times New Roman" w:hAnsi="Times New Roman"/>
+          <w:rFonts w:ascii="Courier New" w:cs="Courier New" w:eastAsia="Courier New" w:hAnsi="Courier New"/>
+          <w:sz w:val="24"/>
+          <w:szCs w:val="24"/>
+        </w:rPr>
+      </w:pPr>
+      <w:r>
+        <w:rPr>
+          <w:rFonts w:ascii="Courier New" w:cs="Courier New" w:eastAsia="Courier New" w:hAnsi="Courier New"/>
           <w:sz w:val="24"/>
           <w:szCs w:val="24"/>
           <w:rtl w:val="0"/>
         </w:rPr>
         <w:t xml:space="preserve">npx expo start --web</w:t>
       </w:r>
-    </w:p>
-    <w:p>
-      <w:pPr>
-        <w:spacing w:after="60" w:before="120" w:line="276" w:lineRule="auto"/>
-        <w:rPr>
-          <w:rFonts w:ascii="Times New Roman" w:cs="Times New Roman" w:eastAsia="Times New Roman" w:hAnsi="Times New Roman"/>
-          <w:sz w:val="24"/>
-          <w:szCs w:val="24"/>
-        </w:rPr>
-      </w:pPr>
-      <w:r>
-        <w:rPr>
-          <w:rFonts w:ascii="Times New Roman" w:cs="Times New Roman" w:eastAsia="Times New Roman" w:hAnsi="Times New Roman"/>
-          <w:sz w:val="24"/>
-          <w:szCs w:val="24"/>
-          <w:rtl w:val="0"/>
-        </w:rPr>
-        <w:t xml:space="preserve">vagy</w:t>
-      </w:r>
-    </w:p>
-    <w:p>
-      <w:pPr>
-        <w:spacing w:after="60" w:before="120" w:line="276" w:lineRule="auto"/>
-        <w:ind w:left="720" w:hanging="360"/>
-        <w:rPr>
-          <w:rFonts w:ascii="Times New Roman" w:cs="Times New Roman" w:eastAsia="Times New Roman" w:hAnsi="Times New Roman"/>
-          <w:sz w:val="24"/>
-          <w:szCs w:val="24"/>
-        </w:rPr>
-      </w:pPr>
-      <w:r>
-        <w:rPr>
-          <w:rFonts w:ascii="Times New Roman" w:cs="Times New Roman" w:eastAsia="Times New Roman" w:hAnsi="Times New Roman"/>
+      <w:r>
+        <w:rPr>
+          <w:rFonts w:ascii="Times New Roman" w:cs="Times New Roman" w:eastAsia="Times New Roman" w:hAnsi="Times New Roman"/>
+          <w:sz w:val="24"/>
+          <w:szCs w:val="24"/>
+          <w:rtl w:val="0"/>
+        </w:rPr>
+        <w:t xml:space="preserve"> vagy </w:t>
+      </w:r>
+      <w:r>
+        <w:rPr>
+          <w:rFonts w:ascii="Courier New" w:cs="Courier New" w:eastAsia="Courier New" w:hAnsi="Courier New"/>
           <w:sz w:val="24"/>
           <w:szCs w:val="24"/>
           <w:rtl w:val="0"/>
@@ -8479,18 +8436,34 @@
           <w:szCs w:val="24"/>
           <w:rtl w:val="0"/>
         </w:rPr>
-        <w:t xml:space="preserve">Fő funkciók</w:t>
-      </w:r>
-    </w:p>
-    <w:p>
-      <w:pPr>
-        <w:spacing w:after="60" w:before="120" w:line="276" w:lineRule="auto"/>
-        <w:rPr>
-          <w:rFonts w:ascii="Times New Roman" w:cs="Times New Roman" w:eastAsia="Times New Roman" w:hAnsi="Times New Roman"/>
-          <w:sz w:val="24"/>
-          <w:szCs w:val="24"/>
-        </w:rPr>
-      </w:pPr>
+        <w:t xml:space="preserve">Navigálás</w:t>
+      </w:r>
+      <w:r>
+        <w:rPr>
+          <w:rtl w:val="0"/>
+        </w:rPr>
+      </w:r>
+    </w:p>
+    <w:p>
+      <w:pPr>
+        <w:spacing w:after="60" w:before="120" w:line="276" w:lineRule="auto"/>
+        <w:jc w:val="left"/>
+        <w:rPr>
+          <w:rFonts w:ascii="Times New Roman" w:cs="Times New Roman" w:eastAsia="Times New Roman" w:hAnsi="Times New Roman"/>
+          <w:sz w:val="24"/>
+          <w:szCs w:val="24"/>
+        </w:rPr>
+      </w:pPr>
+      <w:r>
+        <w:rPr>
+          <w:rFonts w:ascii="Times New Roman" w:cs="Times New Roman" w:eastAsia="Times New Roman" w:hAnsi="Times New Roman"/>
+          <w:sz w:val="24"/>
+          <w:szCs w:val="24"/>
+          <w:rtl w:val="0"/>
+        </w:rPr>
+        <w:t xml:space="preserve">A navigálást a mobilalkalmazásban az alábbi ábra mutatja be:</w:t>
+        <w:br w:type="textWrapping"/>
+      </w:r>
       <w:r>
         <w:rPr>
           <w:rFonts w:ascii="Times New Roman" w:cs="Times New Roman" w:eastAsia="Times New Roman" w:hAnsi="Times New Roman"/>
@@ -8499,6 +8472,48 @@
           <w:rtl w:val="0"/>
         </w:rPr>
         <w:t xml:space="preserve">A kezdőképernyőről azonnal elérhetők a legfontosabb funkciók:</w:t>
+      </w:r>
+      <w:r>
+        <w:drawing>
+          <wp:anchor allowOverlap="1" behindDoc="0" distB="114300" distT="114300" distL="114300" distR="114300" hidden="0" layoutInCell="1" locked="0" relativeHeight="0" simplePos="0">
+            <wp:simplePos x="0" y="0"/>
+            <wp:positionH relativeFrom="column">
+              <wp:posOffset>682625</wp:posOffset>
+            </wp:positionH>
+            <wp:positionV relativeFrom="paragraph">
+              <wp:posOffset>447675</wp:posOffset>
+            </wp:positionV>
+            <wp:extent cx="4320000" cy="5918400"/>
+            <wp:effectExtent b="0" l="0" r="0" t="0"/>
+            <wp:wrapTopAndBottom distB="114300" distT="114300"/>
+            <wp:docPr id="3" name="image1.png"/>
+            <a:graphic>
+              <a:graphicData uri="http://schemas.openxmlformats.org/drawingml/2006/picture">
+                <pic:pic>
+                  <pic:nvPicPr>
+                    <pic:cNvPr id="0" name="image1.png"/>
+                    <pic:cNvPicPr preferRelativeResize="0"/>
+                  </pic:nvPicPr>
+                  <pic:blipFill>
+                    <a:blip r:embed="rId31"/>
+                    <a:srcRect b="0" l="0" r="0" t="0"/>
+                    <a:stretch>
+                      <a:fillRect/>
+                    </a:stretch>
+                  </pic:blipFill>
+                  <pic:spPr>
+                    <a:xfrm>
+                      <a:off x="0" y="0"/>
+                      <a:ext cx="4320000" cy="5918400"/>
+                    </a:xfrm>
+                    <a:prstGeom prst="rect"/>
+                    <a:ln/>
+                  </pic:spPr>
+                </pic:pic>
+              </a:graphicData>
+            </a:graphic>
+          </wp:anchor>
+        </w:drawing>
       </w:r>
     </w:p>
     <w:p>
@@ -8519,8 +8534,6 @@
       <w:r>
         <w:rPr>
           <w:rFonts w:ascii="Times New Roman" w:cs="Times New Roman" w:eastAsia="Times New Roman" w:hAnsi="Times New Roman"/>
-          <w:b w:val="1"/>
-          <w:bCs w:val="1"/>
           <w:sz w:val="24"/>
           <w:szCs w:val="24"/>
           <w:rtl w:val="0"/>
@@ -8546,8 +8559,6 @@
       <w:r>
         <w:rPr>
           <w:rFonts w:ascii="Times New Roman" w:cs="Times New Roman" w:eastAsia="Times New Roman" w:hAnsi="Times New Roman"/>
-          <w:b w:val="1"/>
-          <w:bCs w:val="1"/>
           <w:sz w:val="24"/>
           <w:szCs w:val="24"/>
           <w:rtl w:val="0"/>
@@ -8573,8 +8584,6 @@
       <w:r>
         <w:rPr>
           <w:rFonts w:ascii="Times New Roman" w:cs="Times New Roman" w:eastAsia="Times New Roman" w:hAnsi="Times New Roman"/>
-          <w:b w:val="1"/>
-          <w:bCs w:val="1"/>
           <w:sz w:val="24"/>
           <w:szCs w:val="24"/>
           <w:rtl w:val="0"/>
@@ -8600,8 +8609,6 @@
       <w:r>
         <w:rPr>
           <w:rFonts w:ascii="Times New Roman" w:cs="Times New Roman" w:eastAsia="Times New Roman" w:hAnsi="Times New Roman"/>
-          <w:b w:val="1"/>
-          <w:bCs w:val="1"/>
           <w:sz w:val="24"/>
           <w:szCs w:val="24"/>
           <w:rtl w:val="0"/>
@@ -8627,8 +8634,6 @@
       <w:r>
         <w:rPr>
           <w:rFonts w:ascii="Times New Roman" w:cs="Times New Roman" w:eastAsia="Times New Roman" w:hAnsi="Times New Roman"/>
-          <w:b w:val="1"/>
-          <w:bCs w:val="1"/>
           <w:sz w:val="24"/>
           <w:szCs w:val="24"/>
           <w:rtl w:val="0"/>
@@ -8719,7 +8724,7 @@
       <w:pPr>
         <w:numPr>
           <w:ilvl w:val="0"/>
-          <w:numId w:val="22"/>
+          <w:numId w:val="20"/>
         </w:numPr>
         <w:spacing w:after="60" w:before="120" w:line="276" w:lineRule="auto"/>
         <w:ind w:left="720" w:hanging="360"/>
@@ -8744,7 +8749,7 @@
       <w:pPr>
         <w:numPr>
           <w:ilvl w:val="0"/>
-          <w:numId w:val="22"/>
+          <w:numId w:val="20"/>
         </w:numPr>
         <w:spacing w:after="60" w:before="120" w:line="276" w:lineRule="auto"/>
         <w:ind w:left="720" w:hanging="360"/>
@@ -8769,7 +8774,7 @@
       <w:pPr>
         <w:numPr>
           <w:ilvl w:val="0"/>
-          <w:numId w:val="22"/>
+          <w:numId w:val="20"/>
         </w:numPr>
         <w:spacing w:after="60" w:before="120" w:line="276" w:lineRule="auto"/>
         <w:ind w:left="720" w:hanging="360"/>
@@ -8889,26 +8894,11 @@
     </w:p>
     <w:p>
       <w:pPr>
-        <w:spacing w:after="60" w:before="120" w:line="276" w:lineRule="auto"/>
-        <w:rPr>
-          <w:rFonts w:ascii="Times New Roman" w:cs="Times New Roman" w:eastAsia="Times New Roman" w:hAnsi="Times New Roman"/>
-          <w:sz w:val="24"/>
-          <w:szCs w:val="24"/>
-        </w:rPr>
-      </w:pPr>
-      <w:r>
-        <w:rPr>
-          <w:rtl w:val="0"/>
-        </w:rPr>
-      </w:r>
-    </w:p>
-    <w:p>
-      <w:pPr>
         <w:pStyle w:val="Heading1"/>
         <w:keepNext w:val="0"/>
         <w:keepLines w:val="0"/>
         <w:spacing w:after="60" w:before="120" w:line="276" w:lineRule="auto"/>
-        <w:ind w:left="720" w:hanging="360"/>
+        <w:ind w:left="0" w:firstLine="0"/>
         <w:rPr>
           <w:smallCaps w:val="0"/>
           <w:sz w:val="24"/>
@@ -8925,6 +8915,216 @@
           <w:rtl w:val="0"/>
         </w:rPr>
         <w:t xml:space="preserve">Weboldal</w:t>
+      </w:r>
+    </w:p>
+    <w:p>
+      <w:pPr>
+        <w:pStyle w:val="Heading3"/>
+        <w:keepNext w:val="0"/>
+        <w:keepLines w:val="0"/>
+        <w:spacing w:line="276" w:lineRule="auto"/>
+        <w:ind w:left="720" w:hanging="360"/>
+        <w:rPr/>
+      </w:pPr>
+      <w:bookmarkStart w:colFirst="0" w:colLast="0" w:name="_heading=h.w5b03ze4gsa" w:id="27"/>
+      <w:bookmarkEnd w:id="27"/>
+      <w:r>
+        <w:rPr>
+          <w:rtl w:val="0"/>
+        </w:rPr>
+        <w:t xml:space="preserve">Áttekintés</w:t>
+      </w:r>
+    </w:p>
+    <w:p>
+      <w:pPr>
+        <w:spacing w:after="60" w:before="120" w:line="276" w:lineRule="auto"/>
+        <w:jc w:val="left"/>
+        <w:rPr>
+          <w:rFonts w:ascii="Times New Roman" w:cs="Times New Roman" w:eastAsia="Times New Roman" w:hAnsi="Times New Roman"/>
+          <w:sz w:val="24"/>
+          <w:szCs w:val="24"/>
+        </w:rPr>
+      </w:pPr>
+      <w:r>
+        <w:rPr>
+          <w:rFonts w:ascii="Times New Roman" w:cs="Times New Roman" w:eastAsia="Times New Roman" w:hAnsi="Times New Roman"/>
+          <w:sz w:val="24"/>
+          <w:szCs w:val="24"/>
+          <w:rtl w:val="0"/>
+        </w:rPr>
+        <w:t xml:space="preserve">A weboldal a rendszer nyilvános felhasználói felülete, amelyet az interneten keresztül érnek el a látogatók.</w:t>
+      </w:r>
+    </w:p>
+    <w:p>
+      <w:pPr>
+        <w:spacing w:after="60" w:before="120" w:line="276" w:lineRule="auto"/>
+        <w:jc w:val="left"/>
+        <w:rPr>
+          <w:rFonts w:ascii="Times New Roman" w:cs="Times New Roman" w:eastAsia="Times New Roman" w:hAnsi="Times New Roman"/>
+          <w:sz w:val="24"/>
+          <w:szCs w:val="24"/>
+        </w:rPr>
+      </w:pPr>
+      <w:r>
+        <w:rPr>
+          <w:rFonts w:ascii="Times New Roman" w:cs="Times New Roman" w:eastAsia="Times New Roman" w:hAnsi="Times New Roman"/>
+          <w:sz w:val="24"/>
+          <w:szCs w:val="24"/>
+          <w:rtl w:val="0"/>
+        </w:rPr>
+        <w:t xml:space="preserve">Célja, hogy kiszolgálja:</w:t>
+      </w:r>
+    </w:p>
+    <w:p>
+      <w:pPr>
+        <w:numPr>
+          <w:ilvl w:val="0"/>
+          <w:numId w:val="23"/>
+        </w:numPr>
+        <w:spacing w:after="60" w:before="120" w:line="276" w:lineRule="auto"/>
+        <w:ind w:left="720" w:hanging="360"/>
+        <w:jc w:val="left"/>
+        <w:rPr>
+          <w:rFonts w:ascii="Times New Roman" w:cs="Times New Roman" w:eastAsia="Times New Roman" w:hAnsi="Times New Roman"/>
+          <w:sz w:val="24"/>
+          <w:szCs w:val="24"/>
+        </w:rPr>
+      </w:pPr>
+      <w:r>
+        <w:rPr>
+          <w:rFonts w:ascii="Times New Roman" w:cs="Times New Roman" w:eastAsia="Times New Roman" w:hAnsi="Times New Roman"/>
+          <w:sz w:val="24"/>
+          <w:szCs w:val="24"/>
+          <w:rtl w:val="0"/>
+        </w:rPr>
+        <w:t xml:space="preserve">az ételrendelésre vágyó felhasználókat,</w:t>
+      </w:r>
+    </w:p>
+    <w:p>
+      <w:pPr>
+        <w:numPr>
+          <w:ilvl w:val="0"/>
+          <w:numId w:val="23"/>
+        </w:numPr>
+        <w:spacing w:after="60" w:before="120" w:line="276" w:lineRule="auto"/>
+        <w:ind w:left="720" w:hanging="360"/>
+        <w:jc w:val="left"/>
+        <w:rPr>
+          <w:rFonts w:ascii="Times New Roman" w:cs="Times New Roman" w:eastAsia="Times New Roman" w:hAnsi="Times New Roman"/>
+          <w:sz w:val="24"/>
+          <w:szCs w:val="24"/>
+        </w:rPr>
+      </w:pPr>
+      <w:r>
+        <w:rPr>
+          <w:rFonts w:ascii="Times New Roman" w:cs="Times New Roman" w:eastAsia="Times New Roman" w:hAnsi="Times New Roman"/>
+          <w:sz w:val="24"/>
+          <w:szCs w:val="24"/>
+          <w:rtl w:val="0"/>
+        </w:rPr>
+        <w:t xml:space="preserve">a munkát kereső érdeklődőket,</w:t>
+      </w:r>
+    </w:p>
+    <w:p>
+      <w:pPr>
+        <w:numPr>
+          <w:ilvl w:val="0"/>
+          <w:numId w:val="23"/>
+        </w:numPr>
+        <w:spacing w:after="60" w:before="120" w:line="276" w:lineRule="auto"/>
+        <w:ind w:left="720" w:hanging="360"/>
+        <w:jc w:val="left"/>
+        <w:rPr>
+          <w:rFonts w:ascii="Times New Roman" w:cs="Times New Roman" w:eastAsia="Times New Roman" w:hAnsi="Times New Roman"/>
+          <w:sz w:val="24"/>
+          <w:szCs w:val="24"/>
+        </w:rPr>
+      </w:pPr>
+      <w:r>
+        <w:rPr>
+          <w:rFonts w:ascii="Times New Roman" w:cs="Times New Roman" w:eastAsia="Times New Roman" w:hAnsi="Times New Roman"/>
+          <w:sz w:val="24"/>
+          <w:szCs w:val="24"/>
+          <w:rtl w:val="0"/>
+        </w:rPr>
+        <w:t xml:space="preserve">a vállalkozói partnereket,</w:t>
+      </w:r>
+    </w:p>
+    <w:p>
+      <w:pPr>
+        <w:numPr>
+          <w:ilvl w:val="0"/>
+          <w:numId w:val="23"/>
+        </w:numPr>
+        <w:spacing w:after="60" w:before="120" w:line="276" w:lineRule="auto"/>
+        <w:ind w:left="720" w:hanging="360"/>
+        <w:jc w:val="left"/>
+        <w:rPr>
+          <w:rFonts w:ascii="Times New Roman" w:cs="Times New Roman" w:eastAsia="Times New Roman" w:hAnsi="Times New Roman"/>
+          <w:sz w:val="24"/>
+          <w:szCs w:val="24"/>
+        </w:rPr>
+      </w:pPr>
+      <w:r>
+        <w:rPr>
+          <w:rFonts w:ascii="Times New Roman" w:cs="Times New Roman" w:eastAsia="Times New Roman" w:hAnsi="Times New Roman"/>
+          <w:sz w:val="24"/>
+          <w:szCs w:val="24"/>
+          <w:rtl w:val="0"/>
+        </w:rPr>
+        <w:t xml:space="preserve">valamint az általános látogatókat.</w:t>
+      </w:r>
+    </w:p>
+    <w:p>
+      <w:pPr>
+        <w:spacing w:after="60" w:before="120" w:line="276" w:lineRule="auto"/>
+        <w:jc w:val="left"/>
+        <w:rPr>
+          <w:rFonts w:ascii="Times New Roman" w:cs="Times New Roman" w:eastAsia="Times New Roman" w:hAnsi="Times New Roman"/>
+          <w:b w:val="1"/>
+          <w:bCs w:val="1"/>
+          <w:sz w:val="24"/>
+          <w:szCs w:val="24"/>
+        </w:rPr>
+      </w:pPr>
+      <w:r>
+        <w:rPr>
+          <w:rFonts w:ascii="Times New Roman" w:cs="Times New Roman" w:eastAsia="Times New Roman" w:hAnsi="Times New Roman"/>
+          <w:sz w:val="24"/>
+          <w:szCs w:val="24"/>
+          <w:rtl w:val="0"/>
+        </w:rPr>
+        <w:t xml:space="preserve">A felület dinamikus, modern és felhasználóbarát kialakítású.</w:t>
+      </w:r>
+      <w:r>
+        <w:rPr>
+          <w:rtl w:val="0"/>
+        </w:rPr>
+      </w:r>
+    </w:p>
+    <w:p>
+      <w:pPr>
+        <w:pStyle w:val="Heading1"/>
+        <w:keepNext w:val="0"/>
+        <w:keepLines w:val="0"/>
+        <w:spacing w:after="60" w:before="120" w:line="276" w:lineRule="auto"/>
+        <w:ind w:left="0" w:firstLine="0"/>
+        <w:rPr>
+          <w:smallCaps w:val="0"/>
+          <w:sz w:val="24"/>
+          <w:szCs w:val="24"/>
+        </w:rPr>
+      </w:pPr>
+      <w:bookmarkStart w:colFirst="0" w:colLast="0" w:name="_heading=h.3gy5yqd42hf1" w:id="28"/>
+      <w:bookmarkEnd w:id="28"/>
+      <w:r>
+        <w:rPr>
+          <w:smallCaps w:val="0"/>
+          <w:sz w:val="24"/>
+          <w:szCs w:val="24"/>
+          <w:rtl w:val="0"/>
+        </w:rPr>
+        <w:t xml:space="preserve">Node.js Backend</w:t>
       </w:r>
     </w:p>
     <w:p>
@@ -8940,10 +9140,12 @@
           <w:szCs w:val="24"/>
         </w:rPr>
       </w:pPr>
-      <w:bookmarkStart w:colFirst="0" w:colLast="0" w:name="_heading=h.w5b03ze4gsa" w:id="27"/>
-      <w:bookmarkEnd w:id="27"/>
-      <w:r>
-        <w:rPr>
+      <w:bookmarkStart w:colFirst="0" w:colLast="0" w:name="_heading=h.7v9vt6pw6ucw" w:id="29"/>
+      <w:bookmarkEnd w:id="29"/>
+      <w:r>
+        <w:rPr>
+          <w:b w:val="0"/>
+          <w:bCs w:val="0"/>
           <w:smallCaps w:val="0"/>
           <w:sz w:val="24"/>
           <w:szCs w:val="24"/>
@@ -8951,167 +9153,31 @@
         </w:rPr>
         <w:t xml:space="preserve">Áttekintés</w:t>
       </w:r>
-    </w:p>
-    <w:p>
-      <w:pPr>
-        <w:spacing w:after="60" w:before="120" w:line="276" w:lineRule="auto"/>
-        <w:jc w:val="left"/>
-        <w:rPr>
-          <w:rFonts w:ascii="Times New Roman" w:cs="Times New Roman" w:eastAsia="Times New Roman" w:hAnsi="Times New Roman"/>
-          <w:sz w:val="24"/>
-          <w:szCs w:val="24"/>
-        </w:rPr>
-      </w:pPr>
-      <w:r>
-        <w:rPr>
-          <w:rFonts w:ascii="Times New Roman" w:cs="Times New Roman" w:eastAsia="Times New Roman" w:hAnsi="Times New Roman"/>
-          <w:sz w:val="24"/>
-          <w:szCs w:val="24"/>
-          <w:rtl w:val="0"/>
-        </w:rPr>
-        <w:t xml:space="preserve">A weboldal a rendszer nyilvános felhasználói felülete, amelyet az interneten keresztül érnek el a látogatók.</w:t>
-      </w:r>
-    </w:p>
-    <w:p>
-      <w:pPr>
-        <w:spacing w:after="60" w:before="120" w:line="276" w:lineRule="auto"/>
-        <w:jc w:val="left"/>
-        <w:rPr>
-          <w:rFonts w:ascii="Times New Roman" w:cs="Times New Roman" w:eastAsia="Times New Roman" w:hAnsi="Times New Roman"/>
-          <w:sz w:val="24"/>
-          <w:szCs w:val="24"/>
-        </w:rPr>
-      </w:pPr>
-      <w:r>
-        <w:rPr>
-          <w:rFonts w:ascii="Times New Roman" w:cs="Times New Roman" w:eastAsia="Times New Roman" w:hAnsi="Times New Roman"/>
-          <w:sz w:val="24"/>
-          <w:szCs w:val="24"/>
-          <w:rtl w:val="0"/>
-        </w:rPr>
-        <w:t xml:space="preserve">Célja, hogy kiszolgálja:</w:t>
-      </w:r>
-    </w:p>
-    <w:p>
-      <w:pPr>
-        <w:numPr>
-          <w:ilvl w:val="0"/>
-          <w:numId w:val="25"/>
-        </w:numPr>
-        <w:spacing w:after="60" w:before="120" w:line="276" w:lineRule="auto"/>
-        <w:ind w:left="720" w:hanging="360"/>
-        <w:jc w:val="left"/>
-        <w:rPr>
-          <w:rFonts w:ascii="Times New Roman" w:cs="Times New Roman" w:eastAsia="Times New Roman" w:hAnsi="Times New Roman"/>
-          <w:sz w:val="24"/>
-          <w:szCs w:val="24"/>
-        </w:rPr>
-      </w:pPr>
-      <w:r>
-        <w:rPr>
-          <w:rFonts w:ascii="Times New Roman" w:cs="Times New Roman" w:eastAsia="Times New Roman" w:hAnsi="Times New Roman"/>
-          <w:sz w:val="24"/>
-          <w:szCs w:val="24"/>
-          <w:rtl w:val="0"/>
-        </w:rPr>
-        <w:t xml:space="preserve">az ételrendelésre vágyó felhasználókat,</w:t>
-      </w:r>
-    </w:p>
-    <w:p>
-      <w:pPr>
-        <w:numPr>
-          <w:ilvl w:val="0"/>
-          <w:numId w:val="25"/>
-        </w:numPr>
-        <w:spacing w:after="60" w:before="120" w:line="276" w:lineRule="auto"/>
-        <w:ind w:left="720" w:hanging="360"/>
-        <w:jc w:val="left"/>
-        <w:rPr>
-          <w:rFonts w:ascii="Times New Roman" w:cs="Times New Roman" w:eastAsia="Times New Roman" w:hAnsi="Times New Roman"/>
-          <w:sz w:val="24"/>
-          <w:szCs w:val="24"/>
-        </w:rPr>
-      </w:pPr>
-      <w:r>
-        <w:rPr>
-          <w:rFonts w:ascii="Times New Roman" w:cs="Times New Roman" w:eastAsia="Times New Roman" w:hAnsi="Times New Roman"/>
-          <w:sz w:val="24"/>
-          <w:szCs w:val="24"/>
-          <w:rtl w:val="0"/>
-        </w:rPr>
-        <w:t xml:space="preserve">a munkát kereső érdeklődőket,</w:t>
-      </w:r>
-    </w:p>
-    <w:p>
-      <w:pPr>
-        <w:numPr>
-          <w:ilvl w:val="0"/>
-          <w:numId w:val="25"/>
-        </w:numPr>
-        <w:spacing w:after="60" w:before="120" w:line="276" w:lineRule="auto"/>
-        <w:ind w:left="720" w:hanging="360"/>
-        <w:jc w:val="left"/>
-        <w:rPr>
-          <w:rFonts w:ascii="Times New Roman" w:cs="Times New Roman" w:eastAsia="Times New Roman" w:hAnsi="Times New Roman"/>
-          <w:sz w:val="24"/>
-          <w:szCs w:val="24"/>
-        </w:rPr>
-      </w:pPr>
-      <w:r>
-        <w:rPr>
-          <w:rFonts w:ascii="Times New Roman" w:cs="Times New Roman" w:eastAsia="Times New Roman" w:hAnsi="Times New Roman"/>
-          <w:sz w:val="24"/>
-          <w:szCs w:val="24"/>
-          <w:rtl w:val="0"/>
-        </w:rPr>
-        <w:t xml:space="preserve">a vállalkozói partnereket,</w:t>
-      </w:r>
-    </w:p>
-    <w:p>
-      <w:pPr>
-        <w:numPr>
-          <w:ilvl w:val="0"/>
-          <w:numId w:val="25"/>
-        </w:numPr>
-        <w:spacing w:after="60" w:before="120" w:line="276" w:lineRule="auto"/>
-        <w:ind w:left="720" w:hanging="360"/>
-        <w:jc w:val="left"/>
-        <w:rPr>
-          <w:rFonts w:ascii="Times New Roman" w:cs="Times New Roman" w:eastAsia="Times New Roman" w:hAnsi="Times New Roman"/>
-          <w:sz w:val="24"/>
-          <w:szCs w:val="24"/>
-        </w:rPr>
-      </w:pPr>
-      <w:r>
-        <w:rPr>
-          <w:rFonts w:ascii="Times New Roman" w:cs="Times New Roman" w:eastAsia="Times New Roman" w:hAnsi="Times New Roman"/>
-          <w:sz w:val="24"/>
-          <w:szCs w:val="24"/>
-          <w:rtl w:val="0"/>
-        </w:rPr>
-        <w:t xml:space="preserve">valamint az általános látogatókat.</w:t>
-      </w:r>
-    </w:p>
-    <w:p>
-      <w:pPr>
-        <w:spacing w:after="60" w:before="120" w:line="276" w:lineRule="auto"/>
-        <w:jc w:val="left"/>
-        <w:rPr>
-          <w:rFonts w:ascii="Times New Roman" w:cs="Times New Roman" w:eastAsia="Times New Roman" w:hAnsi="Times New Roman"/>
-          <w:b w:val="1"/>
-          <w:bCs w:val="1"/>
-          <w:sz w:val="24"/>
-          <w:szCs w:val="24"/>
-        </w:rPr>
-      </w:pPr>
-      <w:r>
-        <w:rPr>
-          <w:rFonts w:ascii="Times New Roman" w:cs="Times New Roman" w:eastAsia="Times New Roman" w:hAnsi="Times New Roman"/>
-          <w:sz w:val="24"/>
-          <w:szCs w:val="24"/>
-          <w:rtl w:val="0"/>
-        </w:rPr>
-        <w:t xml:space="preserve">A felület dinamikus, modern és felhasználóbarát kialakítású.</w:t>
+      <w:r>
+        <w:rPr>
+          <w:rtl w:val="0"/>
+        </w:rPr>
+      </w:r>
+    </w:p>
+    <w:p>
+      <w:pPr>
+        <w:spacing w:after="60" w:before="120" w:line="276" w:lineRule="auto"/>
+        <w:jc w:val="left"/>
+        <w:rPr>
+          <w:rFonts w:ascii="Times New Roman" w:cs="Times New Roman" w:eastAsia="Times New Roman" w:hAnsi="Times New Roman"/>
+          <w:color w:val="ff0000"/>
+          <w:sz w:val="24"/>
+          <w:szCs w:val="24"/>
+        </w:rPr>
+      </w:pPr>
+      <w:r>
+        <w:rPr>
+          <w:rFonts w:ascii="Times New Roman" w:cs="Times New Roman" w:eastAsia="Times New Roman" w:hAnsi="Times New Roman"/>
+          <w:sz w:val="24"/>
+          <w:szCs w:val="24"/>
+          <w:rtl w:val="0"/>
+        </w:rPr>
+        <w:t xml:space="preserve">A backend rendszer a teljes alkalmazás központi kiszolgáló oldali egysége, amely az üzleti logikát, az adatkezelést és az adminisztrációs funkciókat biztosítja.</w:t>
       </w:r>
       <w:r>
         <w:rPr>
@@ -9132,8 +9198,8 @@
           <w:szCs w:val="24"/>
         </w:rPr>
       </w:pPr>
-      <w:bookmarkStart w:colFirst="0" w:colLast="0" w:name="_heading=h.3gy5yqd42hf1" w:id="28"/>
-      <w:bookmarkEnd w:id="28"/>
+      <w:bookmarkStart w:colFirst="0" w:colLast="0" w:name="_heading=h.o77aslmnvha1" w:id="30"/>
+      <w:bookmarkEnd w:id="30"/>
       <w:r>
         <w:rPr>
           <w:smallCaps w:val="0"/>
@@ -9141,7 +9207,7 @@
           <w:szCs w:val="24"/>
           <w:rtl w:val="0"/>
         </w:rPr>
-        <w:t xml:space="preserve">Node.js Backend</w:t>
+        <w:t xml:space="preserve">React Admin Felület</w:t>
       </w:r>
     </w:p>
     <w:p>
@@ -9157,8 +9223,8 @@
           <w:szCs w:val="24"/>
         </w:rPr>
       </w:pPr>
-      <w:bookmarkStart w:colFirst="0" w:colLast="0" w:name="_heading=h.7v9vt6pw6ucw" w:id="29"/>
-      <w:bookmarkEnd w:id="29"/>
+      <w:bookmarkStart w:colFirst="0" w:colLast="0" w:name="_heading=h.p4a072eipdlq" w:id="31"/>
+      <w:bookmarkEnd w:id="31"/>
       <w:r>
         <w:rPr>
           <w:smallCaps w:val="0"/>
@@ -9186,7 +9252,7 @@
           <w:szCs w:val="24"/>
           <w:rtl w:val="0"/>
         </w:rPr>
-        <w:t xml:space="preserve">A backend rendszer a teljes alkalmazás központi kiszolgáló oldali egysége, amely az üzleti logikát, az adatkezelést és az adminisztrációs funkciókat biztosítja.</w:t>
+        <w:t xml:space="preserve">A React alapú adminisztrációs felület kifejezetten az adminisztratív feladatokat ellátó felhasználók számára készült.</w:t>
       </w:r>
     </w:p>
     <w:p>
@@ -9201,435 +9267,8 @@
           <w:bCs w:val="1"/>
         </w:rPr>
       </w:pPr>
-      <w:bookmarkStart w:colFirst="0" w:colLast="0" w:name="_heading=h.vqo5wq28p0gq" w:id="30"/>
-      <w:bookmarkEnd w:id="30"/>
-      <w:r>
-        <w:rPr>
-          <w:b w:val="1"/>
-          <w:bCs w:val="1"/>
-          <w:rtl w:val="0"/>
-        </w:rPr>
-        <w:t xml:space="preserve">Célfelhasználók</w:t>
-      </w:r>
-    </w:p>
-    <w:p>
-      <w:pPr>
-        <w:numPr>
-          <w:ilvl w:val="0"/>
-          <w:numId w:val="19"/>
-        </w:numPr>
-        <w:spacing w:after="60" w:before="120" w:line="276" w:lineRule="auto"/>
-        <w:ind w:left="720" w:hanging="360"/>
-        <w:jc w:val="left"/>
-        <w:rPr>
-          <w:rFonts w:ascii="Times New Roman" w:cs="Times New Roman" w:eastAsia="Times New Roman" w:hAnsi="Times New Roman"/>
-          <w:sz w:val="24"/>
-          <w:szCs w:val="24"/>
-        </w:rPr>
-      </w:pPr>
-      <w:r>
-        <w:rPr>
-          <w:rFonts w:ascii="Times New Roman" w:cs="Times New Roman" w:eastAsia="Times New Roman" w:hAnsi="Times New Roman"/>
-          <w:sz w:val="24"/>
-          <w:szCs w:val="24"/>
-          <w:rtl w:val="0"/>
-        </w:rPr>
-        <w:t xml:space="preserve">fejlesztők</w:t>
-      </w:r>
-    </w:p>
-    <w:p>
-      <w:pPr>
-        <w:numPr>
-          <w:ilvl w:val="0"/>
-          <w:numId w:val="19"/>
-        </w:numPr>
-        <w:spacing w:after="60" w:before="120" w:line="276" w:lineRule="auto"/>
-        <w:ind w:left="720" w:hanging="360"/>
-        <w:jc w:val="left"/>
-        <w:rPr>
-          <w:rFonts w:ascii="Times New Roman" w:cs="Times New Roman" w:eastAsia="Times New Roman" w:hAnsi="Times New Roman"/>
-          <w:sz w:val="24"/>
-          <w:szCs w:val="24"/>
-        </w:rPr>
-      </w:pPr>
-      <w:r>
-        <w:rPr>
-          <w:rFonts w:ascii="Times New Roman" w:cs="Times New Roman" w:eastAsia="Times New Roman" w:hAnsi="Times New Roman"/>
-          <w:sz w:val="24"/>
-          <w:szCs w:val="24"/>
-          <w:rtl w:val="0"/>
-        </w:rPr>
-        <w:t xml:space="preserve">rendszergazdák</w:t>
-      </w:r>
-    </w:p>
-    <w:p>
-      <w:pPr>
-        <w:numPr>
-          <w:ilvl w:val="0"/>
-          <w:numId w:val="19"/>
-        </w:numPr>
-        <w:spacing w:after="60" w:before="120" w:line="276" w:lineRule="auto"/>
-        <w:ind w:left="720" w:hanging="360"/>
-        <w:jc w:val="left"/>
-        <w:rPr>
-          <w:rFonts w:ascii="Times New Roman" w:cs="Times New Roman" w:eastAsia="Times New Roman" w:hAnsi="Times New Roman"/>
-          <w:sz w:val="24"/>
-          <w:szCs w:val="24"/>
-        </w:rPr>
-      </w:pPr>
-      <w:r>
-        <w:rPr>
-          <w:rFonts w:ascii="Times New Roman" w:cs="Times New Roman" w:eastAsia="Times New Roman" w:hAnsi="Times New Roman"/>
-          <w:sz w:val="24"/>
-          <w:szCs w:val="24"/>
-          <w:rtl w:val="0"/>
-        </w:rPr>
-        <w:t xml:space="preserve">technikai üzemeltetők</w:t>
-      </w:r>
-    </w:p>
-    <w:p>
-      <w:pPr>
-        <w:spacing w:after="60" w:before="120" w:line="276" w:lineRule="auto"/>
-        <w:ind w:left="0" w:firstLine="0"/>
-        <w:jc w:val="left"/>
-        <w:rPr>
-          <w:rFonts w:ascii="Times New Roman" w:cs="Times New Roman" w:eastAsia="Times New Roman" w:hAnsi="Times New Roman"/>
-          <w:b w:val="1"/>
-          <w:bCs w:val="1"/>
-          <w:sz w:val="24"/>
-          <w:szCs w:val="24"/>
-        </w:rPr>
-      </w:pPr>
-      <w:r>
-        <w:rPr>
-          <w:rFonts w:ascii="Times New Roman" w:cs="Times New Roman" w:eastAsia="Times New Roman" w:hAnsi="Times New Roman"/>
-          <w:b w:val="1"/>
-          <w:bCs w:val="1"/>
-          <w:sz w:val="24"/>
-          <w:szCs w:val="24"/>
-          <w:rtl w:val="0"/>
-        </w:rPr>
-        <w:t xml:space="preserve">Főbb komponensek</w:t>
-      </w:r>
-    </w:p>
-    <w:p>
-      <w:pPr>
-        <w:pStyle w:val="Heading3"/>
-        <w:keepNext w:val="0"/>
-        <w:keepLines w:val="0"/>
-        <w:numPr>
-          <w:ilvl w:val="0"/>
-          <w:numId w:val="19"/>
-        </w:numPr>
-        <w:spacing w:after="60" w:before="120" w:line="276" w:lineRule="auto"/>
-        <w:ind w:firstLine="360"/>
-        <w:rPr/>
-      </w:pPr>
-      <w:bookmarkStart w:colFirst="0" w:colLast="0" w:name="_heading=h.p18rkwx2x3bm" w:id="31"/>
-      <w:bookmarkEnd w:id="31"/>
-      <w:r>
-        <w:rPr>
-          <w:b w:val="1"/>
-          <w:bCs w:val="1"/>
-          <w:rtl w:val="0"/>
-        </w:rPr>
-        <w:t xml:space="preserve">Admin Panel</w:t>
-      </w:r>
-    </w:p>
-    <w:p>
-      <w:pPr>
-        <w:numPr>
-          <w:ilvl w:val="0"/>
-          <w:numId w:val="19"/>
-        </w:numPr>
-        <w:spacing w:after="60" w:before="120" w:line="276" w:lineRule="auto"/>
-        <w:ind w:left="720" w:hanging="360"/>
-        <w:jc w:val="left"/>
-        <w:rPr>
-          <w:rFonts w:ascii="Times New Roman" w:cs="Times New Roman" w:eastAsia="Times New Roman" w:hAnsi="Times New Roman"/>
-          <w:sz w:val="24"/>
-          <w:szCs w:val="24"/>
-        </w:rPr>
-      </w:pPr>
-      <w:r>
-        <w:rPr>
-          <w:rFonts w:ascii="Times New Roman" w:cs="Times New Roman" w:eastAsia="Times New Roman" w:hAnsi="Times New Roman"/>
-          <w:sz w:val="24"/>
-          <w:szCs w:val="24"/>
-          <w:rtl w:val="0"/>
-        </w:rPr>
-        <w:t xml:space="preserve">A rendszer kezelésére és konfigurációjára szolgáló adminisztrációs felület.</w:t>
-      </w:r>
-    </w:p>
-    <w:p>
-      <w:pPr>
-        <w:pStyle w:val="Heading3"/>
-        <w:keepNext w:val="0"/>
-        <w:keepLines w:val="0"/>
-        <w:numPr>
-          <w:ilvl w:val="0"/>
-          <w:numId w:val="19"/>
-        </w:numPr>
-        <w:spacing w:after="60" w:before="120" w:line="276" w:lineRule="auto"/>
-        <w:ind w:firstLine="360"/>
-        <w:rPr/>
-      </w:pPr>
-      <w:bookmarkStart w:colFirst="0" w:colLast="0" w:name="_heading=h.8sxd3vieqs7c" w:id="32"/>
+      <w:bookmarkStart w:colFirst="0" w:colLast="0" w:name="_heading=h.nljjtv6ahns7" w:id="32"/>
       <w:bookmarkEnd w:id="32"/>
-      <w:r>
-        <w:rPr>
-          <w:b w:val="1"/>
-          <w:bCs w:val="1"/>
-          <w:rtl w:val="0"/>
-        </w:rPr>
-        <w:t xml:space="preserve">API Dokumentáció</w:t>
-      </w:r>
-    </w:p>
-    <w:p>
-      <w:pPr>
-        <w:numPr>
-          <w:ilvl w:val="0"/>
-          <w:numId w:val="19"/>
-        </w:numPr>
-        <w:spacing w:after="60" w:before="120" w:line="276" w:lineRule="auto"/>
-        <w:ind w:left="720" w:hanging="360"/>
-        <w:jc w:val="left"/>
-        <w:rPr>
-          <w:rFonts w:ascii="Times New Roman" w:cs="Times New Roman" w:eastAsia="Times New Roman" w:hAnsi="Times New Roman"/>
-          <w:sz w:val="24"/>
-          <w:szCs w:val="24"/>
-        </w:rPr>
-      </w:pPr>
-      <w:r>
-        <w:rPr>
-          <w:rFonts w:ascii="Times New Roman" w:cs="Times New Roman" w:eastAsia="Times New Roman" w:hAnsi="Times New Roman"/>
-          <w:sz w:val="24"/>
-          <w:szCs w:val="24"/>
-          <w:rtl w:val="0"/>
-        </w:rPr>
-        <w:t xml:space="preserve">A backend szolgáltatásaihoz tartozó végpontok részletes leírása, amely segíti a fejlesztői integrációt.</w:t>
-      </w:r>
-    </w:p>
-    <w:p>
-      <w:pPr>
-        <w:pStyle w:val="Heading3"/>
-        <w:keepNext w:val="0"/>
-        <w:keepLines w:val="0"/>
-        <w:numPr>
-          <w:ilvl w:val="0"/>
-          <w:numId w:val="19"/>
-        </w:numPr>
-        <w:spacing w:after="60" w:before="120" w:line="276" w:lineRule="auto"/>
-        <w:ind w:firstLine="360"/>
-        <w:rPr/>
-      </w:pPr>
-      <w:bookmarkStart w:colFirst="0" w:colLast="0" w:name="_heading=h.g8dztd7ws8rc" w:id="33"/>
-      <w:bookmarkEnd w:id="33"/>
-      <w:r>
-        <w:rPr>
-          <w:b w:val="1"/>
-          <w:bCs w:val="1"/>
-          <w:rtl w:val="0"/>
-        </w:rPr>
-        <w:t xml:space="preserve">Dashboard</w:t>
-      </w:r>
-    </w:p>
-    <w:p>
-      <w:pPr>
-        <w:numPr>
-          <w:ilvl w:val="0"/>
-          <w:numId w:val="19"/>
-        </w:numPr>
-        <w:spacing w:after="60" w:before="120" w:line="276" w:lineRule="auto"/>
-        <w:ind w:left="720" w:hanging="360"/>
-        <w:jc w:val="left"/>
-        <w:rPr>
-          <w:rFonts w:ascii="Times New Roman" w:cs="Times New Roman" w:eastAsia="Times New Roman" w:hAnsi="Times New Roman"/>
-          <w:sz w:val="24"/>
-          <w:szCs w:val="24"/>
-        </w:rPr>
-      </w:pPr>
-      <w:r>
-        <w:rPr>
-          <w:rFonts w:ascii="Times New Roman" w:cs="Times New Roman" w:eastAsia="Times New Roman" w:hAnsi="Times New Roman"/>
-          <w:sz w:val="24"/>
-          <w:szCs w:val="24"/>
-          <w:rtl w:val="0"/>
-        </w:rPr>
-        <w:t xml:space="preserve">Statisztikai és üzleti adatok vizuális megjelenítése.</w:t>
-      </w:r>
-    </w:p>
-    <w:p>
-      <w:pPr>
-        <w:pStyle w:val="Heading3"/>
-        <w:keepNext w:val="0"/>
-        <w:keepLines w:val="0"/>
-        <w:numPr>
-          <w:ilvl w:val="0"/>
-          <w:numId w:val="19"/>
-        </w:numPr>
-        <w:spacing w:after="60" w:before="120" w:line="276" w:lineRule="auto"/>
-        <w:ind w:firstLine="360"/>
-        <w:rPr/>
-      </w:pPr>
-      <w:bookmarkStart w:colFirst="0" w:colLast="0" w:name="_heading=h.djudh9xmx0af" w:id="34"/>
-      <w:bookmarkEnd w:id="34"/>
-      <w:r>
-        <w:rPr>
-          <w:b w:val="1"/>
-          <w:bCs w:val="1"/>
-          <w:rtl w:val="0"/>
-        </w:rPr>
-        <w:t xml:space="preserve">Health Monitor</w:t>
-      </w:r>
-    </w:p>
-    <w:p>
-      <w:pPr>
-        <w:numPr>
-          <w:ilvl w:val="0"/>
-          <w:numId w:val="19"/>
-        </w:numPr>
-        <w:spacing w:after="60" w:before="120" w:line="276" w:lineRule="auto"/>
-        <w:ind w:left="720" w:hanging="360"/>
-        <w:jc w:val="left"/>
-        <w:rPr>
-          <w:rFonts w:ascii="Times New Roman" w:cs="Times New Roman" w:eastAsia="Times New Roman" w:hAnsi="Times New Roman"/>
-          <w:sz w:val="24"/>
-          <w:szCs w:val="24"/>
-        </w:rPr>
-      </w:pPr>
-      <w:r>
-        <w:rPr>
-          <w:rFonts w:ascii="Times New Roman" w:cs="Times New Roman" w:eastAsia="Times New Roman" w:hAnsi="Times New Roman"/>
-          <w:sz w:val="24"/>
-          <w:szCs w:val="24"/>
-          <w:rtl w:val="0"/>
-        </w:rPr>
-        <w:t xml:space="preserve">A rendszer állapotának folyamatos figyelése, teljesítménymutatók és hibajelzések kezelése.</w:t>
-      </w:r>
-    </w:p>
-    <w:p>
-      <w:pPr>
-        <w:numPr>
-          <w:ilvl w:val="0"/>
-          <w:numId w:val="19"/>
-        </w:numPr>
-        <w:spacing w:after="60" w:before="120" w:line="276" w:lineRule="auto"/>
-        <w:ind w:left="720" w:hanging="360"/>
-        <w:jc w:val="left"/>
-        <w:rPr>
-          <w:rFonts w:ascii="Times New Roman" w:cs="Times New Roman" w:eastAsia="Times New Roman" w:hAnsi="Times New Roman"/>
-          <w:sz w:val="24"/>
-          <w:szCs w:val="24"/>
-        </w:rPr>
-      </w:pPr>
-      <w:r>
-        <w:rPr>
-          <w:rtl w:val="0"/>
-        </w:rPr>
-      </w:r>
-    </w:p>
-    <w:p>
-      <w:pPr>
-        <w:spacing w:after="60" w:before="120" w:line="276" w:lineRule="auto"/>
-        <w:jc w:val="left"/>
-        <w:rPr>
-          <w:rFonts w:ascii="Times New Roman" w:cs="Times New Roman" w:eastAsia="Times New Roman" w:hAnsi="Times New Roman"/>
-          <w:color w:val="ff0000"/>
-          <w:sz w:val="24"/>
-          <w:szCs w:val="24"/>
-        </w:rPr>
-      </w:pPr>
-      <w:r>
-        <w:rPr>
-          <w:rtl w:val="0"/>
-        </w:rPr>
-      </w:r>
-    </w:p>
-    <w:p>
-      <w:pPr>
-        <w:pStyle w:val="Heading1"/>
-        <w:keepNext w:val="0"/>
-        <w:keepLines w:val="0"/>
-        <w:spacing w:after="60" w:before="120" w:line="276" w:lineRule="auto"/>
-        <w:ind w:left="720" w:hanging="360"/>
-        <w:rPr>
-          <w:smallCaps w:val="0"/>
-          <w:sz w:val="24"/>
-          <w:szCs w:val="24"/>
-        </w:rPr>
-      </w:pPr>
-      <w:bookmarkStart w:colFirst="0" w:colLast="0" w:name="_heading=h.o77aslmnvha1" w:id="35"/>
-      <w:bookmarkEnd w:id="35"/>
-      <w:r>
-        <w:rPr>
-          <w:smallCaps w:val="0"/>
-          <w:sz w:val="24"/>
-          <w:szCs w:val="24"/>
-          <w:rtl w:val="0"/>
-        </w:rPr>
-        <w:t xml:space="preserve">React Admin Felület</w:t>
-      </w:r>
-    </w:p>
-    <w:p>
-      <w:pPr>
-        <w:pStyle w:val="Heading2"/>
-        <w:keepNext w:val="0"/>
-        <w:keepLines w:val="0"/>
-        <w:spacing w:after="60" w:before="120" w:line="276" w:lineRule="auto"/>
-        <w:ind w:left="720" w:hanging="360"/>
-        <w:rPr>
-          <w:smallCaps w:val="0"/>
-          <w:sz w:val="24"/>
-          <w:szCs w:val="24"/>
-        </w:rPr>
-      </w:pPr>
-      <w:bookmarkStart w:colFirst="0" w:colLast="0" w:name="_heading=h.p4a072eipdlq" w:id="36"/>
-      <w:bookmarkEnd w:id="36"/>
-      <w:r>
-        <w:rPr>
-          <w:smallCaps w:val="0"/>
-          <w:sz w:val="24"/>
-          <w:szCs w:val="24"/>
-          <w:rtl w:val="0"/>
-        </w:rPr>
-        <w:t xml:space="preserve">Áttekintés</w:t>
-      </w:r>
-    </w:p>
-    <w:p>
-      <w:pPr>
-        <w:spacing w:after="60" w:before="120" w:line="276" w:lineRule="auto"/>
-        <w:jc w:val="left"/>
-        <w:rPr>
-          <w:rFonts w:ascii="Times New Roman" w:cs="Times New Roman" w:eastAsia="Times New Roman" w:hAnsi="Times New Roman"/>
-          <w:sz w:val="24"/>
-          <w:szCs w:val="24"/>
-        </w:rPr>
-      </w:pPr>
-      <w:r>
-        <w:rPr>
-          <w:rFonts w:ascii="Times New Roman" w:cs="Times New Roman" w:eastAsia="Times New Roman" w:hAnsi="Times New Roman"/>
-          <w:sz w:val="24"/>
-          <w:szCs w:val="24"/>
-          <w:rtl w:val="0"/>
-        </w:rPr>
-        <w:t xml:space="preserve">A React alapú adminisztrációs felület kifejezetten az adminisztratív feladatokat ellátó felhasználók számára készült.</w:t>
-      </w:r>
-    </w:p>
-    <w:p>
-      <w:pPr>
-        <w:pStyle w:val="Heading3"/>
-        <w:keepNext w:val="0"/>
-        <w:keepLines w:val="0"/>
-        <w:spacing w:after="60" w:before="120" w:line="276" w:lineRule="auto"/>
-        <w:ind w:firstLine="360"/>
-        <w:rPr>
-          <w:b w:val="1"/>
-          <w:bCs w:val="1"/>
-        </w:rPr>
-      </w:pPr>
-      <w:bookmarkStart w:colFirst="0" w:colLast="0" w:name="_heading=h.nljjtv6ahns7" w:id="37"/>
-      <w:bookmarkEnd w:id="37"/>
       <w:r>
         <w:rPr>
           <w:b w:val="1"/>
@@ -9747,8 +9386,8 @@
           <w:szCs w:val="24"/>
         </w:rPr>
       </w:pPr>
-      <w:bookmarkStart w:colFirst="0" w:colLast="0" w:name="_heading=h.fowzjwyh10on" w:id="38"/>
-      <w:bookmarkEnd w:id="38"/>
+      <w:bookmarkStart w:colFirst="0" w:colLast="0" w:name="_heading=h.fowzjwyh10on" w:id="33"/>
+      <w:bookmarkEnd w:id="33"/>
       <w:r>
         <w:rPr>
           <w:smallCaps w:val="0"/>
@@ -9783,8 +9422,8 @@
           <w:szCs w:val="24"/>
         </w:rPr>
       </w:pPr>
-      <w:bookmarkStart w:colFirst="0" w:colLast="0" w:name="_heading=h.icgxy7w28bah" w:id="39"/>
-      <w:bookmarkEnd w:id="39"/>
+      <w:bookmarkStart w:colFirst="0" w:colLast="0" w:name="_heading=h.icgxy7w28bah" w:id="34"/>
+      <w:bookmarkEnd w:id="34"/>
       <w:r>
         <w:rPr>
           <w:smallCaps w:val="0"/>
@@ -9851,8 +9490,8 @@
           <w:szCs w:val="24"/>
         </w:rPr>
       </w:pPr>
-      <w:bookmarkStart w:colFirst="0" w:colLast="0" w:name="_heading=h.8q3hkx76fofi" w:id="40"/>
-      <w:bookmarkEnd w:id="40"/>
+      <w:bookmarkStart w:colFirst="0" w:colLast="0" w:name="_heading=h.8q3hkx76fofi" w:id="35"/>
+      <w:bookmarkEnd w:id="35"/>
       <w:r>
         <w:rPr>
           <w:sz w:val="24"/>
@@ -9973,8 +9612,8 @@
           <w:szCs w:val="24"/>
         </w:rPr>
       </w:pPr>
-      <w:bookmarkStart w:colFirst="0" w:colLast="0" w:name="_heading=h.nw0czcnsvgl8" w:id="41"/>
-      <w:bookmarkEnd w:id="41"/>
+      <w:bookmarkStart w:colFirst="0" w:colLast="0" w:name="_heading=h.nw0czcnsvgl8" w:id="36"/>
+      <w:bookmarkEnd w:id="36"/>
       <w:r>
         <w:rPr>
           <w:b w:val="0"/>
@@ -9991,7 +9630,7 @@
       <w:pPr>
         <w:numPr>
           <w:ilvl w:val="0"/>
-          <w:numId w:val="28"/>
+          <w:numId w:val="26"/>
         </w:numPr>
         <w:spacing w:after="60" w:before="120" w:line="276" w:lineRule="auto"/>
         <w:ind w:left="720" w:hanging="360"/>
@@ -10016,7 +9655,7 @@
       <w:pPr>
         <w:numPr>
           <w:ilvl w:val="0"/>
-          <w:numId w:val="28"/>
+          <w:numId w:val="26"/>
         </w:numPr>
         <w:spacing w:after="60" w:before="120" w:line="276" w:lineRule="auto"/>
         <w:ind w:left="720" w:hanging="360"/>
@@ -10041,7 +9680,7 @@
       <w:pPr>
         <w:numPr>
           <w:ilvl w:val="0"/>
-          <w:numId w:val="28"/>
+          <w:numId w:val="26"/>
         </w:numPr>
         <w:spacing w:after="60" w:before="120" w:line="276" w:lineRule="auto"/>
         <w:ind w:left="720" w:hanging="360"/>
@@ -10066,7 +9705,7 @@
       <w:pPr>
         <w:numPr>
           <w:ilvl w:val="0"/>
-          <w:numId w:val="28"/>
+          <w:numId w:val="26"/>
         </w:numPr>
         <w:spacing w:after="60" w:before="120" w:line="276" w:lineRule="auto"/>
         <w:ind w:left="720" w:hanging="360"/>
@@ -10143,8 +9782,8 @@
           <w:szCs w:val="24"/>
         </w:rPr>
       </w:pPr>
-      <w:bookmarkStart w:colFirst="0" w:colLast="0" w:name="_heading=h.8xvvqs6bbu9o" w:id="42"/>
-      <w:bookmarkEnd w:id="42"/>
+      <w:bookmarkStart w:colFirst="0" w:colLast="0" w:name="_heading=h.8xvvqs6bbu9o" w:id="37"/>
+      <w:bookmarkEnd w:id="37"/>
       <w:r>
         <w:rPr>
           <w:b w:val="0"/>
@@ -10202,8 +9841,8 @@
         <w:ind w:left="0"/>
         <w:rPr/>
       </w:pPr>
-      <w:bookmarkStart w:colFirst="0" w:colLast="0" w:name="_heading=h.3zslddws4tkf" w:id="43"/>
-      <w:bookmarkEnd w:id="43"/>
+      <w:bookmarkStart w:colFirst="0" w:colLast="0" w:name="_heading=h.3zslddws4tkf" w:id="38"/>
+      <w:bookmarkEnd w:id="38"/>
       <w:r>
         <w:rPr>
           <w:rtl w:val="0"/>
@@ -10420,8 +10059,8 @@
           <w:szCs w:val="24"/>
         </w:rPr>
       </w:pPr>
-      <w:bookmarkStart w:colFirst="0" w:colLast="0" w:name="_heading=h.9yq7abje0web" w:id="44"/>
-      <w:bookmarkEnd w:id="44"/>
+      <w:bookmarkStart w:colFirst="0" w:colLast="0" w:name="_heading=h.9yq7abje0web" w:id="39"/>
+      <w:bookmarkEnd w:id="39"/>
       <w:r>
         <w:rPr>
           <w:b w:val="0"/>
@@ -10443,8 +10082,8 @@
         <w:ind w:left="0"/>
         <w:rPr/>
       </w:pPr>
-      <w:bookmarkStart w:colFirst="0" w:colLast="0" w:name="_heading=h.59teuc17umap" w:id="45"/>
-      <w:bookmarkEnd w:id="45"/>
+      <w:bookmarkStart w:colFirst="0" w:colLast="0" w:name="_heading=h.59teuc17umap" w:id="40"/>
+      <w:bookmarkEnd w:id="40"/>
       <w:r>
         <w:rPr>
           <w:rtl w:val="0"/>
@@ -10504,8 +10143,8 @@
         <w:ind w:left="0"/>
         <w:rPr/>
       </w:pPr>
-      <w:bookmarkStart w:colFirst="0" w:colLast="0" w:name="_heading=h.php00jdrb2lv" w:id="46"/>
-      <w:bookmarkEnd w:id="46"/>
+      <w:bookmarkStart w:colFirst="0" w:colLast="0" w:name="_heading=h.php00jdrb2lv" w:id="41"/>
+      <w:bookmarkEnd w:id="41"/>
       <w:r>
         <w:rPr>
           <w:rtl w:val="0"/>
@@ -10658,8 +10297,8 @@
         <w:ind w:left="0"/>
         <w:rPr/>
       </w:pPr>
-      <w:bookmarkStart w:colFirst="0" w:colLast="0" w:name="_heading=h.osf8szpk3dw8" w:id="47"/>
-      <w:bookmarkEnd w:id="47"/>
+      <w:bookmarkStart w:colFirst="0" w:colLast="0" w:name="_heading=h.osf8szpk3dw8" w:id="42"/>
+      <w:bookmarkEnd w:id="42"/>
       <w:r>
         <w:rPr>
           <w:rtl w:val="0"/>
@@ -10711,7 +10350,7 @@
       <w:pPr>
         <w:numPr>
           <w:ilvl w:val="0"/>
-          <w:numId w:val="15"/>
+          <w:numId w:val="14"/>
         </w:numPr>
         <w:spacing w:after="60" w:before="120" w:line="276" w:lineRule="auto"/>
         <w:ind w:left="720" w:hanging="360"/>
@@ -10736,7 +10375,7 @@
       <w:pPr>
         <w:numPr>
           <w:ilvl w:val="0"/>
-          <w:numId w:val="15"/>
+          <w:numId w:val="14"/>
         </w:numPr>
         <w:spacing w:after="60" w:before="120" w:line="276" w:lineRule="auto"/>
         <w:ind w:left="720" w:hanging="360"/>
@@ -10761,7 +10400,7 @@
       <w:pPr>
         <w:numPr>
           <w:ilvl w:val="0"/>
-          <w:numId w:val="15"/>
+          <w:numId w:val="14"/>
         </w:numPr>
         <w:spacing w:after="60" w:before="120" w:line="276" w:lineRule="auto"/>
         <w:ind w:left="720" w:hanging="360"/>
@@ -10808,7 +10447,7 @@
         <w:widowControl w:val="1"/>
         <w:numPr>
           <w:ilvl w:val="0"/>
-          <w:numId w:val="15"/>
+          <w:numId w:val="14"/>
         </w:numPr>
         <w:pBdr>
           <w:top w:space="0" w:sz="0" w:val="nil"/>
@@ -10850,16 +10489,18 @@
           <w:szCs w:val="24"/>
         </w:rPr>
       </w:pPr>
-      <w:bookmarkStart w:colFirst="0" w:colLast="0" w:name="_heading=h.at4cksqe909h" w:id="48"/>
-      <w:bookmarkEnd w:id="48"/>
-      <w:r>
-        <w:rPr>
-          <w:smallCaps w:val="0"/>
-          <w:sz w:val="24"/>
-          <w:szCs w:val="24"/>
+      <w:bookmarkStart w:colFirst="0" w:colLast="0" w:name="_heading=h.at4cksqe909h" w:id="43"/>
+      <w:bookmarkEnd w:id="43"/>
+      <w:r>
+        <w:rPr>
           <w:rtl w:val="0"/>
         </w:rPr>
         <w:t xml:space="preserve">Tesztelés</w:t>
+      </w:r>
+      <w:r>
+        <w:rPr>
+          <w:rtl w:val="0"/>
+        </w:rPr>
       </w:r>
     </w:p>
     <w:p>
@@ -10894,8 +10535,8 @@
           <w:bCs w:val="1"/>
         </w:rPr>
       </w:pPr>
-      <w:bookmarkStart w:colFirst="0" w:colLast="0" w:name="_heading=h.w0hio8jpxhsv" w:id="49"/>
-      <w:bookmarkEnd w:id="49"/>
+      <w:bookmarkStart w:colFirst="0" w:colLast="0" w:name="_heading=h.w0hio8jpxhsv" w:id="44"/>
+      <w:bookmarkEnd w:id="44"/>
       <w:r>
         <w:rPr>
           <w:b w:val="1"/>
@@ -10909,7 +10550,7 @@
       <w:pPr>
         <w:numPr>
           <w:ilvl w:val="0"/>
-          <w:numId w:val="23"/>
+          <w:numId w:val="21"/>
         </w:numPr>
         <w:spacing w:after="60" w:before="120" w:line="276" w:lineRule="auto"/>
         <w:ind w:left="720" w:hanging="360"/>
@@ -10934,7 +10575,7 @@
       <w:pPr>
         <w:numPr>
           <w:ilvl w:val="0"/>
-          <w:numId w:val="23"/>
+          <w:numId w:val="21"/>
         </w:numPr>
         <w:spacing w:after="60" w:before="120" w:line="276" w:lineRule="auto"/>
         <w:ind w:left="720" w:hanging="360"/>
@@ -10959,7 +10600,7 @@
       <w:pPr>
         <w:numPr>
           <w:ilvl w:val="0"/>
-          <w:numId w:val="23"/>
+          <w:numId w:val="21"/>
         </w:numPr>
         <w:spacing w:after="60" w:before="120" w:line="276" w:lineRule="auto"/>
         <w:ind w:left="720" w:hanging="360"/>
@@ -10984,7 +10625,7 @@
       <w:pPr>
         <w:numPr>
           <w:ilvl w:val="0"/>
-          <w:numId w:val="23"/>
+          <w:numId w:val="21"/>
         </w:numPr>
         <w:spacing w:after="60" w:before="120" w:line="276" w:lineRule="auto"/>
         <w:ind w:left="720" w:hanging="360"/>
@@ -11009,7 +10650,7 @@
       <w:pPr>
         <w:numPr>
           <w:ilvl w:val="0"/>
-          <w:numId w:val="23"/>
+          <w:numId w:val="21"/>
         </w:numPr>
         <w:spacing w:after="60" w:before="120" w:line="276" w:lineRule="auto"/>
         <w:ind w:left="720" w:hanging="360"/>
@@ -11084,16 +10725,18 @@
           <w:szCs w:val="24"/>
         </w:rPr>
       </w:pPr>
-      <w:bookmarkStart w:colFirst="0" w:colLast="0" w:name="_heading=h.6x4dn6p0kl0w" w:id="50"/>
-      <w:bookmarkEnd w:id="50"/>
-      <w:r>
-        <w:rPr>
-          <w:smallCaps w:val="0"/>
-          <w:sz w:val="24"/>
-          <w:szCs w:val="24"/>
+      <w:bookmarkStart w:colFirst="0" w:colLast="0" w:name="_heading=h.6x4dn6p0kl0w" w:id="45"/>
+      <w:bookmarkEnd w:id="45"/>
+      <w:r>
+        <w:rPr>
           <w:rtl w:val="0"/>
         </w:rPr>
         <w:t xml:space="preserve">Összegzés</w:t>
+      </w:r>
+      <w:r>
+        <w:rPr>
+          <w:rtl w:val="0"/>
+        </w:rPr>
       </w:r>
     </w:p>
     <w:p>
@@ -11177,8 +10820,8 @@
           <w:szCs w:val="24"/>
         </w:rPr>
       </w:pPr>
-      <w:bookmarkStart w:colFirst="0" w:colLast="0" w:name="_heading=h.wcjry13f3291" w:id="51"/>
-      <w:bookmarkEnd w:id="51"/>
+      <w:bookmarkStart w:colFirst="0" w:colLast="0" w:name="_heading=h.wcjry13f3291" w:id="46"/>
+      <w:bookmarkEnd w:id="46"/>
       <w:r>
         <w:rPr>
           <w:rFonts w:ascii="Times New Roman" w:cs="Times New Roman" w:eastAsia="Times New Roman" w:hAnsi="Times New Roman"/>
@@ -11189,7 +10832,7 @@
           <w:szCs w:val="24"/>
           <w:rtl w:val="0"/>
         </w:rPr>
-        <w:t xml:space="preserve">1.2.1.2 Cél és hatókör</w:t>
+        <w:t xml:space="preserve">Cél és hatókör</w:t>
       </w:r>
     </w:p>
     <w:p>
@@ -11216,7 +10859,7 @@
       <w:pPr>
         <w:numPr>
           <w:ilvl w:val="0"/>
-          <w:numId w:val="24"/>
+          <w:numId w:val="22"/>
         </w:numPr>
         <w:spacing w:after="60" w:before="120" w:line="276" w:lineRule="auto"/>
         <w:ind w:left="720" w:hanging="360"/>
@@ -11241,7 +10884,7 @@
       <w:pPr>
         <w:numPr>
           <w:ilvl w:val="0"/>
-          <w:numId w:val="24"/>
+          <w:numId w:val="22"/>
         </w:numPr>
         <w:spacing w:after="60" w:before="120" w:line="276" w:lineRule="auto"/>
         <w:ind w:left="720" w:hanging="360"/>
@@ -11266,7 +10909,7 @@
       <w:pPr>
         <w:numPr>
           <w:ilvl w:val="0"/>
-          <w:numId w:val="24"/>
+          <w:numId w:val="22"/>
         </w:numPr>
         <w:spacing w:after="60" w:before="120" w:line="276" w:lineRule="auto"/>
         <w:ind w:left="720" w:hanging="360"/>
@@ -11291,7 +10934,7 @@
       <w:pPr>
         <w:numPr>
           <w:ilvl w:val="0"/>
-          <w:numId w:val="24"/>
+          <w:numId w:val="22"/>
         </w:numPr>
         <w:spacing w:after="60" w:before="120" w:line="276" w:lineRule="auto"/>
         <w:ind w:left="720" w:hanging="360"/>
@@ -11333,8 +10976,8 @@
           <w:szCs w:val="24"/>
         </w:rPr>
       </w:pPr>
-      <w:bookmarkStart w:colFirst="0" w:colLast="0" w:name="_heading=h.8nz8b7gz4pwx" w:id="52"/>
-      <w:bookmarkEnd w:id="52"/>
+      <w:bookmarkStart w:colFirst="0" w:colLast="0" w:name="_heading=h.8nz8b7gz4pwx" w:id="47"/>
+      <w:bookmarkEnd w:id="47"/>
       <w:r>
         <w:rPr>
           <w:rFonts w:ascii="Times New Roman" w:cs="Times New Roman" w:eastAsia="Times New Roman" w:hAnsi="Times New Roman"/>
@@ -11345,7 +10988,7 @@
           <w:szCs w:val="24"/>
           <w:rtl w:val="0"/>
         </w:rPr>
-        <w:t xml:space="preserve">1.2.1.3 Szerepkörök és jogosultságok</w:t>
+        <w:t xml:space="preserve">Szerepkörök és jogosultságok</w:t>
       </w:r>
     </w:p>
     <w:p>
@@ -11469,19 +11112,25 @@
           <w:szCs w:val="24"/>
         </w:rPr>
       </w:pPr>
-      <w:bookmarkStart w:colFirst="0" w:colLast="0" w:name="_heading=h.2azjtsy0b0fx" w:id="53"/>
-      <w:bookmarkEnd w:id="53"/>
+      <w:bookmarkStart w:colFirst="0" w:colLast="0" w:name="_heading=h.2azjtsy0b0fx" w:id="48"/>
+      <w:bookmarkEnd w:id="48"/>
       <w:r>
         <w:rPr>
           <w:rFonts w:ascii="Times New Roman" w:cs="Times New Roman" w:eastAsia="Times New Roman" w:hAnsi="Times New Roman"/>
           <w:b w:val="1"/>
           <w:bCs w:val="1"/>
+          <w:smallCaps w:val="1"/>
           <w:color w:val="000000"/>
-          <w:sz w:val="24"/>
-          <w:szCs w:val="24"/>
-          <w:rtl w:val="0"/>
-        </w:rPr>
-        <w:t xml:space="preserve">1.2.1.4 Fogalomtár</w:t>
+          <w:sz w:val="32"/>
+          <w:szCs w:val="32"/>
+          <w:rtl w:val="0"/>
+        </w:rPr>
+        <w:t xml:space="preserve">Fogalomtár</w:t>
+      </w:r>
+      <w:r>
+        <w:rPr>
+          <w:rtl w:val="0"/>
+        </w:rPr>
       </w:r>
     </w:p>
     <w:p>
@@ -11728,8 +11377,8 @@
           <w:szCs w:val="24"/>
         </w:rPr>
       </w:pPr>
-      <w:bookmarkStart w:colFirst="0" w:colLast="0" w:name="_heading=h.sq1zp39wwvns" w:id="54"/>
-      <w:bookmarkEnd w:id="54"/>
+      <w:bookmarkStart w:colFirst="0" w:colLast="0" w:name="_heading=h.sq1zp39wwvns" w:id="49"/>
+      <w:bookmarkEnd w:id="49"/>
       <w:r>
         <w:rPr>
           <w:rFonts w:ascii="Times New Roman" w:cs="Times New Roman" w:eastAsia="Times New Roman" w:hAnsi="Times New Roman"/>
@@ -11740,7 +11389,7 @@
           <w:szCs w:val="24"/>
           <w:rtl w:val="0"/>
         </w:rPr>
-        <w:t xml:space="preserve">1.2.1.5 Adatmodell áttekintés (logikai, egyszerű)</w:t>
+        <w:t xml:space="preserve">Adatmodell áttekintés (logikai, egyszerű)</w:t>
       </w:r>
     </w:p>
     <w:p>
@@ -11859,8 +11508,8 @@
           <w:szCs w:val="24"/>
         </w:rPr>
       </w:pPr>
-      <w:bookmarkStart w:colFirst="0" w:colLast="0" w:name="_heading=h.lyd15daeourk" w:id="55"/>
-      <w:bookmarkEnd w:id="55"/>
+      <w:bookmarkStart w:colFirst="0" w:colLast="0" w:name="_heading=h.lyd15daeourk" w:id="50"/>
+      <w:bookmarkEnd w:id="50"/>
       <w:r>
         <w:rPr>
           <w:rFonts w:ascii="Times New Roman" w:cs="Times New Roman" w:eastAsia="Times New Roman" w:hAnsi="Times New Roman"/>
@@ -11871,7 +11520,7 @@
           <w:szCs w:val="24"/>
           <w:rtl w:val="0"/>
         </w:rPr>
-        <w:t xml:space="preserve">1.2.1.6 Üzleti szabályok</w:t>
+        <w:t xml:space="preserve">Üzleti szabályok</w:t>
       </w:r>
     </w:p>
     <w:p>
@@ -11990,8 +11639,8 @@
           <w:szCs w:val="24"/>
         </w:rPr>
       </w:pPr>
-      <w:bookmarkStart w:colFirst="0" w:colLast="0" w:name="_heading=h.dnqwm21l6reg" w:id="56"/>
-      <w:bookmarkEnd w:id="56"/>
+      <w:bookmarkStart w:colFirst="0" w:colLast="0" w:name="_heading=h.dnqwm21l6reg" w:id="51"/>
+      <w:bookmarkEnd w:id="51"/>
       <w:r>
         <w:rPr>
           <w:rFonts w:ascii="Times New Roman" w:cs="Times New Roman" w:eastAsia="Times New Roman" w:hAnsi="Times New Roman"/>
@@ -12002,7 +11651,7 @@
           <w:szCs w:val="24"/>
           <w:rtl w:val="0"/>
         </w:rPr>
-        <w:t xml:space="preserve">1.2.1.7 Funkcionális követelmények</w:t>
+        <w:t xml:space="preserve">Funkcionális követelmények</w:t>
       </w:r>
     </w:p>
     <w:p>
@@ -12029,7 +11678,7 @@
       <w:pPr>
         <w:numPr>
           <w:ilvl w:val="0"/>
-          <w:numId w:val="27"/>
+          <w:numId w:val="25"/>
         </w:numPr>
         <w:spacing w:after="60" w:before="120" w:line="276" w:lineRule="auto"/>
         <w:ind w:left="720" w:hanging="360"/>
@@ -12054,7 +11703,7 @@
       <w:pPr>
         <w:numPr>
           <w:ilvl w:val="0"/>
-          <w:numId w:val="27"/>
+          <w:numId w:val="25"/>
         </w:numPr>
         <w:spacing w:after="60" w:before="120" w:line="276" w:lineRule="auto"/>
         <w:ind w:left="720" w:hanging="360"/>
@@ -12079,7 +11728,7 @@
       <w:pPr>
         <w:numPr>
           <w:ilvl w:val="0"/>
-          <w:numId w:val="27"/>
+          <w:numId w:val="25"/>
         </w:numPr>
         <w:spacing w:after="60" w:before="120" w:line="276" w:lineRule="auto"/>
         <w:ind w:left="720" w:hanging="360"/>
@@ -12104,7 +11753,7 @@
       <w:pPr>
         <w:numPr>
           <w:ilvl w:val="0"/>
-          <w:numId w:val="27"/>
+          <w:numId w:val="25"/>
         </w:numPr>
         <w:spacing w:after="60" w:before="120" w:line="276" w:lineRule="auto"/>
         <w:ind w:left="720" w:hanging="360"/>
@@ -12129,7 +11778,7 @@
       <w:pPr>
         <w:numPr>
           <w:ilvl w:val="0"/>
-          <w:numId w:val="27"/>
+          <w:numId w:val="25"/>
         </w:numPr>
         <w:spacing w:after="60" w:before="120" w:line="276" w:lineRule="auto"/>
         <w:ind w:left="720" w:hanging="360"/>
@@ -12207,8 +11856,8 @@
           <w:szCs w:val="24"/>
         </w:rPr>
       </w:pPr>
-      <w:bookmarkStart w:colFirst="0" w:colLast="0" w:name="_heading=h.tadbeof8jbd0" w:id="57"/>
-      <w:bookmarkEnd w:id="57"/>
+      <w:bookmarkStart w:colFirst="0" w:colLast="0" w:name="_heading=h.tadbeof8jbd0" w:id="52"/>
+      <w:bookmarkEnd w:id="52"/>
       <w:r>
         <w:rPr>
           <w:rFonts w:ascii="Times New Roman" w:cs="Times New Roman" w:eastAsia="Times New Roman" w:hAnsi="Times New Roman"/>
@@ -12219,7 +11868,7 @@
           <w:szCs w:val="24"/>
           <w:rtl w:val="0"/>
         </w:rPr>
-        <w:t xml:space="preserve">1.2.1.8 Nem-funkcionális követelmények</w:t>
+        <w:t xml:space="preserve">Nem-funkcionális követelmények</w:t>
       </w:r>
     </w:p>
     <w:p>
@@ -12318,8 +11967,8 @@
           <w:szCs w:val="24"/>
         </w:rPr>
       </w:pPr>
-      <w:bookmarkStart w:colFirst="0" w:colLast="0" w:name="_heading=h.kzi2g5biqngb" w:id="58"/>
-      <w:bookmarkEnd w:id="58"/>
+      <w:bookmarkStart w:colFirst="0" w:colLast="0" w:name="_heading=h.kzi2g5biqngb" w:id="53"/>
+      <w:bookmarkEnd w:id="53"/>
       <w:r>
         <w:rPr>
           <w:rFonts w:ascii="Times New Roman" w:cs="Times New Roman" w:eastAsia="Times New Roman" w:hAnsi="Times New Roman"/>
@@ -12330,7 +11979,7 @@
           <w:szCs w:val="24"/>
           <w:rtl w:val="0"/>
         </w:rPr>
-        <w:t xml:space="preserve">1.2.1.9 Definition of Done (DoD) – v1</w:t>
+        <w:t xml:space="preserve">Definition of Done (DoD) – v1</w:t>
       </w:r>
     </w:p>
     <w:p>
@@ -12373,7 +12022,7 @@
       <w:pPr>
         <w:numPr>
           <w:ilvl w:val="0"/>
-          <w:numId w:val="31"/>
+          <w:numId w:val="29"/>
         </w:numPr>
         <w:spacing w:after="60" w:before="120" w:line="276" w:lineRule="auto"/>
         <w:ind w:left="720" w:hanging="360"/>
@@ -12400,7 +12049,7 @@
       <w:pPr>
         <w:numPr>
           <w:ilvl w:val="0"/>
-          <w:numId w:val="31"/>
+          <w:numId w:val="29"/>
         </w:numPr>
         <w:spacing w:after="60" w:before="120" w:line="276" w:lineRule="auto"/>
         <w:ind w:left="720" w:hanging="360"/>
@@ -12425,7 +12074,7 @@
       <w:pPr>
         <w:numPr>
           <w:ilvl w:val="0"/>
-          <w:numId w:val="31"/>
+          <w:numId w:val="29"/>
         </w:numPr>
         <w:spacing w:after="60" w:before="120" w:line="276" w:lineRule="auto"/>
         <w:ind w:left="720" w:hanging="360"/>
@@ -12450,7 +12099,7 @@
       <w:pPr>
         <w:numPr>
           <w:ilvl w:val="0"/>
-          <w:numId w:val="31"/>
+          <w:numId w:val="29"/>
         </w:numPr>
         <w:spacing w:after="60" w:before="120" w:line="276" w:lineRule="auto"/>
         <w:ind w:left="720" w:hanging="360"/>
@@ -12475,7 +12124,7 @@
       <w:pPr>
         <w:numPr>
           <w:ilvl w:val="0"/>
-          <w:numId w:val="31"/>
+          <w:numId w:val="29"/>
         </w:numPr>
         <w:spacing w:after="60" w:before="120" w:line="276" w:lineRule="auto"/>
         <w:ind w:left="720" w:hanging="360"/>
@@ -12500,7 +12149,7 @@
       <w:pPr>
         <w:numPr>
           <w:ilvl w:val="0"/>
-          <w:numId w:val="31"/>
+          <w:numId w:val="29"/>
         </w:numPr>
         <w:spacing w:after="60" w:before="120" w:line="276" w:lineRule="auto"/>
         <w:ind w:left="720" w:hanging="360"/>
@@ -12586,8 +12235,8 @@
           <w:szCs w:val="24"/>
         </w:rPr>
       </w:pPr>
-      <w:bookmarkStart w:colFirst="0" w:colLast="0" w:name="_heading=h.eq27j9ukoaz9" w:id="59"/>
-      <w:bookmarkEnd w:id="59"/>
+      <w:bookmarkStart w:colFirst="0" w:colLast="0" w:name="_heading=h.eq27j9ukoaz9" w:id="54"/>
+      <w:bookmarkEnd w:id="54"/>
       <w:r>
         <w:rPr>
           <w:sz w:val="24"/>
@@ -12599,22 +12248,205 @@
     </w:p>
     <w:p>
       <w:pPr>
-        <w:spacing w:after="60" w:before="120" w:line="276" w:lineRule="auto"/>
-        <w:ind w:left="360" w:firstLine="0"/>
-        <w:rPr>
-          <w:rFonts w:ascii="Times New Roman" w:cs="Times New Roman" w:eastAsia="Times New Roman" w:hAnsi="Times New Roman"/>
-          <w:sz w:val="24"/>
-          <w:szCs w:val="24"/>
-        </w:rPr>
-      </w:pPr>
-      <w:r>
-        <w:rPr>
-          <w:rFonts w:ascii="Times New Roman" w:cs="Times New Roman" w:eastAsia="Times New Roman" w:hAnsi="Times New Roman"/>
-          <w:sz w:val="24"/>
-          <w:szCs w:val="24"/>
-          <w:rtl w:val="0"/>
-        </w:rPr>
-        <w:t xml:space="preserve">Elkészítettük a saját webshopunk webes, desktop és mobil felületét. A felületeken megjelennek az adatok adatbázisból. A mobil kliens app használható rendelések leadására, míg a futár app a futárok munkáját segíti.</w:t>
+        <w:keepNext w:val="0"/>
+        <w:keepLines w:val="0"/>
+        <w:pageBreakBefore w:val="0"/>
+        <w:widowControl w:val="1"/>
+        <w:pBdr>
+          <w:top w:space="0" w:sz="0" w:val="nil"/>
+          <w:left w:space="0" w:sz="0" w:val="nil"/>
+          <w:bottom w:space="0" w:sz="0" w:val="nil"/>
+          <w:right w:space="0" w:sz="0" w:val="nil"/>
+          <w:between w:space="0" w:sz="0" w:val="nil"/>
+        </w:pBdr>
+        <w:shd w:fill="auto" w:val="clear"/>
+        <w:spacing w:after="60" w:before="120" w:line="276" w:lineRule="auto"/>
+        <w:ind w:right="0"/>
+        <w:jc w:val="left"/>
+        <w:rPr>
+          <w:rFonts w:ascii="Times New Roman" w:cs="Times New Roman" w:eastAsia="Times New Roman" w:hAnsi="Times New Roman"/>
+          <w:sz w:val="24"/>
+          <w:szCs w:val="24"/>
+        </w:rPr>
+      </w:pPr>
+      <w:r>
+        <w:rPr>
+          <w:rFonts w:ascii="Times New Roman" w:cs="Times New Roman" w:eastAsia="Times New Roman" w:hAnsi="Times New Roman"/>
+          <w:sz w:val="24"/>
+          <w:szCs w:val="24"/>
+          <w:rtl w:val="0"/>
+        </w:rPr>
+        <w:t xml:space="preserve">A Royal Delivery projekt során egy komplex, többplatformos ételrendelő rendszert valósítottunk meg, amely webes, mobilos és asztali környezetben egyaránt működőképes. A fejlesztés eredményeként létrehoztunk egy olyan alkalmazás-ökoszisztémát, amely képes a felhasználók, a futárok és az adminisztrátorok kiszolgálására is.</w:t>
+      </w:r>
+    </w:p>
+    <w:p>
+      <w:pPr>
+        <w:keepNext w:val="0"/>
+        <w:keepLines w:val="0"/>
+        <w:pageBreakBefore w:val="0"/>
+        <w:widowControl w:val="1"/>
+        <w:pBdr>
+          <w:top w:space="0" w:sz="0" w:val="nil"/>
+          <w:left w:space="0" w:sz="0" w:val="nil"/>
+          <w:bottom w:space="0" w:sz="0" w:val="nil"/>
+          <w:right w:space="0" w:sz="0" w:val="nil"/>
+          <w:between w:space="0" w:sz="0" w:val="nil"/>
+        </w:pBdr>
+        <w:shd w:fill="auto" w:val="clear"/>
+        <w:spacing w:after="60" w:before="120" w:line="276" w:lineRule="auto"/>
+        <w:ind w:right="0"/>
+        <w:jc w:val="left"/>
+        <w:rPr>
+          <w:rFonts w:ascii="Times New Roman" w:cs="Times New Roman" w:eastAsia="Times New Roman" w:hAnsi="Times New Roman"/>
+          <w:sz w:val="24"/>
+          <w:szCs w:val="24"/>
+        </w:rPr>
+      </w:pPr>
+      <w:r>
+        <w:rPr>
+          <w:rFonts w:ascii="Times New Roman" w:cs="Times New Roman" w:eastAsia="Times New Roman" w:hAnsi="Times New Roman"/>
+          <w:sz w:val="24"/>
+          <w:szCs w:val="24"/>
+          <w:rtl w:val="0"/>
+        </w:rPr>
+        <w:t xml:space="preserve">Az ötlet újszerűsége abban rejlik, hogy a projekt keretében sok különböző technológiát és platformot hangoltunk össze. A rendszer nem csak webalkalmazás, hanem mobilalkalmazást és webes admin felületet is tartalmaz.</w:t>
+      </w:r>
+    </w:p>
+    <w:p>
+      <w:pPr>
+        <w:keepNext w:val="0"/>
+        <w:keepLines w:val="0"/>
+        <w:pageBreakBefore w:val="0"/>
+        <w:widowControl w:val="1"/>
+        <w:pBdr>
+          <w:top w:space="0" w:sz="0" w:val="nil"/>
+          <w:left w:space="0" w:sz="0" w:val="nil"/>
+          <w:bottom w:space="0" w:sz="0" w:val="nil"/>
+          <w:right w:space="0" w:sz="0" w:val="nil"/>
+          <w:between w:space="0" w:sz="0" w:val="nil"/>
+        </w:pBdr>
+        <w:shd w:fill="auto" w:val="clear"/>
+        <w:spacing w:after="60" w:before="120" w:line="276" w:lineRule="auto"/>
+        <w:ind w:right="0"/>
+        <w:jc w:val="left"/>
+        <w:rPr>
+          <w:rFonts w:ascii="Times New Roman" w:cs="Times New Roman" w:eastAsia="Times New Roman" w:hAnsi="Times New Roman"/>
+          <w:sz w:val="24"/>
+          <w:szCs w:val="24"/>
+        </w:rPr>
+      </w:pPr>
+      <w:r>
+        <w:rPr>
+          <w:rFonts w:ascii="Times New Roman" w:cs="Times New Roman" w:eastAsia="Times New Roman" w:hAnsi="Times New Roman"/>
+          <w:sz w:val="24"/>
+          <w:szCs w:val="24"/>
+          <w:rtl w:val="0"/>
+        </w:rPr>
+        <w:t xml:space="preserve">A megoldás eredetisége a technológiák kombinációjában és az architektúra kialakításában jelenik meg. A projekt során külön backend megoldásokat, eltérő adatbázisokat és többféle frontend technológiát alkalmaztunk, miközben biztosítottuk azok együttműködését. Az MVVM architektúra alkalmazása az asztali alkalmazásban, valamint a RESTful API használata a rendszer kommunikációjához hozzájárult a strukturált és jól skálázható felépítéshez.</w:t>
+      </w:r>
+    </w:p>
+    <w:p>
+      <w:pPr>
+        <w:keepNext w:val="0"/>
+        <w:keepLines w:val="0"/>
+        <w:pageBreakBefore w:val="0"/>
+        <w:widowControl w:val="1"/>
+        <w:pBdr>
+          <w:top w:space="0" w:sz="0" w:val="nil"/>
+          <w:left w:space="0" w:sz="0" w:val="nil"/>
+          <w:bottom w:space="0" w:sz="0" w:val="nil"/>
+          <w:right w:space="0" w:sz="0" w:val="nil"/>
+          <w:between w:space="0" w:sz="0" w:val="nil"/>
+        </w:pBdr>
+        <w:shd w:fill="auto" w:val="clear"/>
+        <w:spacing w:after="60" w:before="120" w:line="276" w:lineRule="auto"/>
+        <w:ind w:right="0"/>
+        <w:jc w:val="left"/>
+        <w:rPr>
+          <w:rFonts w:ascii="Times New Roman" w:cs="Times New Roman" w:eastAsia="Times New Roman" w:hAnsi="Times New Roman"/>
+          <w:sz w:val="24"/>
+          <w:szCs w:val="24"/>
+        </w:rPr>
+      </w:pPr>
+      <w:r>
+        <w:rPr>
+          <w:rFonts w:ascii="Times New Roman" w:cs="Times New Roman" w:eastAsia="Times New Roman" w:hAnsi="Times New Roman"/>
+          <w:sz w:val="24"/>
+          <w:szCs w:val="24"/>
+          <w:rtl w:val="0"/>
+        </w:rPr>
+        <w:t xml:space="preserve">A projekt egy valós és széles körben ismert problémára kínál megoldást: az ételrendelési folyamat digitalizálására és egyszerűsítésére. Bár a rendszer demonstrációs célú, funkcionalitása alapján alkalmas arra, hogy egy valódi szolgáltatás alapját képezze. A felhasználók képesek éttermek és ételek böngészésére, rendelések leadására, míg az adminisztrátorok kezelni tudják az adatokat és nyomon követhetik a működést.</w:t>
+      </w:r>
+    </w:p>
+    <w:p>
+      <w:pPr>
+        <w:keepNext w:val="0"/>
+        <w:keepLines w:val="0"/>
+        <w:pageBreakBefore w:val="0"/>
+        <w:widowControl w:val="1"/>
+        <w:pBdr>
+          <w:top w:space="0" w:sz="0" w:val="nil"/>
+          <w:left w:space="0" w:sz="0" w:val="nil"/>
+          <w:bottom w:space="0" w:sz="0" w:val="nil"/>
+          <w:right w:space="0" w:sz="0" w:val="nil"/>
+          <w:between w:space="0" w:sz="0" w:val="nil"/>
+        </w:pBdr>
+        <w:shd w:fill="auto" w:val="clear"/>
+        <w:spacing w:after="60" w:before="120" w:line="276" w:lineRule="auto"/>
+        <w:ind w:right="0"/>
+        <w:jc w:val="left"/>
+        <w:rPr>
+          <w:rFonts w:ascii="Times New Roman" w:cs="Times New Roman" w:eastAsia="Times New Roman" w:hAnsi="Times New Roman"/>
+          <w:sz w:val="24"/>
+          <w:szCs w:val="24"/>
+        </w:rPr>
+      </w:pPr>
+      <w:r>
+        <w:rPr>
+          <w:rFonts w:ascii="Times New Roman" w:cs="Times New Roman" w:eastAsia="Times New Roman" w:hAnsi="Times New Roman"/>
+          <w:sz w:val="24"/>
+          <w:szCs w:val="24"/>
+          <w:rtl w:val="0"/>
+        </w:rPr>
+        <w:t xml:space="preserve">A rendszer különálló komponensekből épül fel, amelyek jól elkülöníthetők, ezáltal könnyebben karbantarthatók és továbbfejleszthetők. A verziókezelés, a rendszeres tesztelés és a dokumentációkészítés hozzájárult a fejlesztés átláthatóságához és minőségéhez.</w:t>
+      </w:r>
+    </w:p>
+    <w:p>
+      <w:pPr>
+        <w:keepNext w:val="0"/>
+        <w:keepLines w:val="0"/>
+        <w:pageBreakBefore w:val="0"/>
+        <w:widowControl w:val="1"/>
+        <w:pBdr>
+          <w:top w:space="0" w:sz="0" w:val="nil"/>
+          <w:left w:space="0" w:sz="0" w:val="nil"/>
+          <w:bottom w:space="0" w:sz="0" w:val="nil"/>
+          <w:right w:space="0" w:sz="0" w:val="nil"/>
+          <w:between w:space="0" w:sz="0" w:val="nil"/>
+        </w:pBdr>
+        <w:shd w:fill="auto" w:val="clear"/>
+        <w:spacing w:after="60" w:before="120" w:line="276" w:lineRule="auto"/>
+        <w:ind w:right="0"/>
+        <w:jc w:val="left"/>
+        <w:rPr>
+          <w:rFonts w:ascii="Times New Roman" w:cs="Times New Roman" w:eastAsia="Times New Roman" w:hAnsi="Times New Roman"/>
+          <w:sz w:val="24"/>
+          <w:szCs w:val="24"/>
+        </w:rPr>
+      </w:pPr>
+      <w:r>
+        <w:rPr>
+          <w:rFonts w:ascii="Times New Roman" w:cs="Times New Roman" w:eastAsia="Times New Roman" w:hAnsi="Times New Roman"/>
+          <w:sz w:val="24"/>
+          <w:szCs w:val="24"/>
+          <w:rtl w:val="0"/>
+        </w:rPr>
+        <w:t xml:space="preserve">Az elkészült pályaműt igyekeztünk logikusan és világosan felépíteni. A dokumentáció részletesen bemutatja a rendszer célját, működését, architektúráját és használatát. A fejezetek egymásra épülnek, így könnyen követhető a teljes fejlesztési folyamat a tervezéstől a megvalósításon át a tesztelésig.</w:t>
+      </w:r>
+      <w:r>
+        <w:rPr>
+          <w:rtl w:val="0"/>
+        </w:rPr>
       </w:r>
     </w:p>
     <w:p>
@@ -12626,8 +12458,8 @@
           <w:szCs w:val="24"/>
         </w:rPr>
       </w:pPr>
-      <w:bookmarkStart w:colFirst="0" w:colLast="0" w:name="_heading=h.d6brtss1pd3n" w:id="60"/>
-      <w:bookmarkEnd w:id="60"/>
+      <w:bookmarkStart w:colFirst="0" w:colLast="0" w:name="_heading=h.d6brtss1pd3n" w:id="55"/>
+      <w:bookmarkEnd w:id="55"/>
       <w:r>
         <w:rPr>
           <w:sz w:val="24"/>
@@ -12639,22 +12471,35 @@
     </w:p>
     <w:p>
       <w:pPr>
-        <w:spacing w:after="60" w:before="120" w:line="276" w:lineRule="auto"/>
-        <w:ind w:left="360" w:firstLine="0"/>
-        <w:rPr>
-          <w:rFonts w:ascii="Times New Roman" w:cs="Times New Roman" w:eastAsia="Times New Roman" w:hAnsi="Times New Roman"/>
-          <w:sz w:val="24"/>
-          <w:szCs w:val="24"/>
-        </w:rPr>
-      </w:pPr>
-      <w:r>
-        <w:rPr>
-          <w:rFonts w:ascii="Times New Roman" w:cs="Times New Roman" w:eastAsia="Times New Roman" w:hAnsi="Times New Roman"/>
-          <w:sz w:val="24"/>
-          <w:szCs w:val="24"/>
-          <w:rtl w:val="0"/>
-        </w:rPr>
-        <w:t xml:space="preserve">Célunk, hogy az alkalmazást globalizáljuk, hogy több nyelven is elérhető legyen, legalább angolul és magyarul.</w:t>
+        <w:keepNext w:val="0"/>
+        <w:keepLines w:val="0"/>
+        <w:pageBreakBefore w:val="0"/>
+        <w:widowControl w:val="1"/>
+        <w:pBdr>
+          <w:top w:space="0" w:sz="0" w:val="nil"/>
+          <w:left w:space="0" w:sz="0" w:val="nil"/>
+          <w:bottom w:space="0" w:sz="0" w:val="nil"/>
+          <w:right w:space="0" w:sz="0" w:val="nil"/>
+          <w:between w:space="0" w:sz="0" w:val="nil"/>
+        </w:pBdr>
+        <w:shd w:fill="auto" w:val="clear"/>
+        <w:spacing w:after="60" w:before="120" w:line="276" w:lineRule="auto"/>
+        <w:ind w:left="0" w:right="0" w:firstLine="0"/>
+        <w:jc w:val="left"/>
+        <w:rPr>
+          <w:rFonts w:ascii="Times New Roman" w:cs="Times New Roman" w:eastAsia="Times New Roman" w:hAnsi="Times New Roman"/>
+          <w:sz w:val="24"/>
+          <w:szCs w:val="24"/>
+        </w:rPr>
+      </w:pPr>
+      <w:r>
+        <w:rPr>
+          <w:rFonts w:ascii="Times New Roman" w:cs="Times New Roman" w:eastAsia="Times New Roman" w:hAnsi="Times New Roman"/>
+          <w:sz w:val="24"/>
+          <w:szCs w:val="24"/>
+          <w:rtl w:val="0"/>
+        </w:rPr>
+        <w:t xml:space="preserve">Célunk, hogy az alkalmazást globalizáljuk, és több nyelven is elérhetővé tegyük, legalább magyar és angol nyelven. Emellett tervezzük további funkciók, például az online fizetés integrálását megvalósítani Stripe-pal, és a felhasználói élmény további javítását css-sel és Expo Stylesheets-szel.</w:t>
       </w:r>
     </w:p>
     <w:p>
@@ -12671,8 +12516,8 @@
           <w:szCs w:val="24"/>
         </w:rPr>
       </w:pPr>
-      <w:bookmarkStart w:colFirst="0" w:colLast="0" w:name="_heading=h.ipve46fladoi" w:id="61"/>
-      <w:bookmarkEnd w:id="61"/>
+      <w:bookmarkStart w:colFirst="0" w:colLast="0" w:name="_heading=h.ipve46fladoi" w:id="56"/>
+      <w:bookmarkEnd w:id="56"/>
       <w:r>
         <w:rPr>
           <w:sz w:val="24"/>
@@ -12689,12 +12534,20 @@
     </w:p>
     <w:p>
       <w:pPr>
-        <w:numPr>
-          <w:ilvl w:val="0"/>
-          <w:numId w:val="21"/>
-        </w:numPr>
-        <w:spacing w:after="60" w:before="120" w:line="276" w:lineRule="auto"/>
-        <w:ind w:left="720" w:hanging="360"/>
+        <w:keepNext w:val="0"/>
+        <w:keepLines w:val="0"/>
+        <w:pageBreakBefore w:val="0"/>
+        <w:widowControl w:val="1"/>
+        <w:pBdr>
+          <w:top w:space="0" w:sz="0" w:val="nil"/>
+          <w:left w:space="0" w:sz="0" w:val="nil"/>
+          <w:bottom w:space="0" w:sz="0" w:val="nil"/>
+          <w:right w:space="0" w:sz="0" w:val="nil"/>
+          <w:between w:space="0" w:sz="0" w:val="nil"/>
+        </w:pBdr>
+        <w:shd w:fill="auto" w:val="clear"/>
+        <w:spacing w:after="60" w:before="120" w:line="276" w:lineRule="auto"/>
+        <w:ind w:left="0" w:right="0" w:firstLine="0"/>
         <w:jc w:val="left"/>
         <w:rPr>
           <w:rFonts w:ascii="Times New Roman" w:cs="Times New Roman" w:eastAsia="Times New Roman" w:hAnsi="Times New Roman"/>
@@ -12714,52 +12567,101 @@
     </w:p>
     <w:p>
       <w:pPr>
-        <w:numPr>
-          <w:ilvl w:val="0"/>
-          <w:numId w:val="21"/>
-        </w:numPr>
-        <w:spacing w:after="60" w:before="120" w:line="276" w:lineRule="auto"/>
-        <w:ind w:left="720" w:hanging="360"/>
-        <w:jc w:val="left"/>
-        <w:rPr>
-          <w:rFonts w:ascii="Times New Roman" w:cs="Times New Roman" w:eastAsia="Times New Roman" w:hAnsi="Times New Roman"/>
-          <w:sz w:val="24"/>
-          <w:szCs w:val="24"/>
-        </w:rPr>
-      </w:pPr>
-      <w:r>
-        <w:rPr>
-          <w:rFonts w:ascii="Times New Roman" w:cs="Times New Roman" w:eastAsia="Times New Roman" w:hAnsi="Times New Roman"/>
-          <w:sz w:val="24"/>
-          <w:szCs w:val="24"/>
-          <w:rtl w:val="0"/>
-        </w:rPr>
-        <w:t xml:space="preserve">A munka során nem csupán technikai tudásunk fejlődött, hanem tapasztalatot szereztünk a csapatmunkában, a rendszertervezésben és a projektmenedzsmentben is.</w:t>
-      </w:r>
-    </w:p>
-    <w:p>
-      <w:pPr>
-        <w:numPr>
-          <w:ilvl w:val="0"/>
-          <w:numId w:val="21"/>
-        </w:numPr>
-        <w:spacing w:after="60" w:before="120" w:line="276" w:lineRule="auto"/>
-        <w:ind w:left="720" w:hanging="360"/>
-        <w:jc w:val="left"/>
-        <w:rPr>
-          <w:rFonts w:ascii="Times New Roman" w:cs="Times New Roman" w:eastAsia="Times New Roman" w:hAnsi="Times New Roman"/>
-          <w:sz w:val="24"/>
-          <w:szCs w:val="24"/>
-        </w:rPr>
-      </w:pPr>
-      <w:r>
-        <w:rPr>
-          <w:rFonts w:ascii="Times New Roman" w:cs="Times New Roman" w:eastAsia="Times New Roman" w:hAnsi="Times New Roman"/>
-          <w:sz w:val="24"/>
-          <w:szCs w:val="24"/>
-          <w:rtl w:val="0"/>
-        </w:rPr>
-        <w:t xml:space="preserve">A Royal Delivery nem csupán egy vizsgaprojekt, hanem egy olyan szakmai mérföldkő, amely jól reprezentálja a csapat fejlődését, elkötelezettségét és gyakorlati tudását a modern szoftverfejlesztés területén.</w:t>
+        <w:keepNext w:val="0"/>
+        <w:keepLines w:val="0"/>
+        <w:pageBreakBefore w:val="0"/>
+        <w:widowControl w:val="1"/>
+        <w:pBdr>
+          <w:top w:space="0" w:sz="0" w:val="nil"/>
+          <w:left w:space="0" w:sz="0" w:val="nil"/>
+          <w:bottom w:space="0" w:sz="0" w:val="nil"/>
+          <w:right w:space="0" w:sz="0" w:val="nil"/>
+          <w:between w:space="0" w:sz="0" w:val="nil"/>
+        </w:pBdr>
+        <w:shd w:fill="auto" w:val="clear"/>
+        <w:spacing w:after="60" w:before="120" w:line="276" w:lineRule="auto"/>
+        <w:ind w:left="0" w:right="0" w:firstLine="0"/>
+        <w:jc w:val="left"/>
+        <w:rPr>
+          <w:rFonts w:ascii="Times New Roman" w:cs="Times New Roman" w:eastAsia="Times New Roman" w:hAnsi="Times New Roman"/>
+          <w:sz w:val="24"/>
+          <w:szCs w:val="24"/>
+        </w:rPr>
+      </w:pPr>
+      <w:r>
+        <w:rPr>
+          <w:rFonts w:ascii="Times New Roman" w:cs="Times New Roman" w:eastAsia="Times New Roman" w:hAnsi="Times New Roman"/>
+          <w:sz w:val="24"/>
+          <w:szCs w:val="24"/>
+          <w:rtl w:val="0"/>
+        </w:rPr>
+        <w:t xml:space="preserve">A munka során nem csupán technikai tudásunk fejlődött, hanem jelentős tapasztalatot szereztünk a csapatmunkában, a rendszertervezésben és a projektmenedzsmentben is.</w:t>
+      </w:r>
+    </w:p>
+    <w:p>
+      <w:pPr>
+        <w:keepNext w:val="0"/>
+        <w:keepLines w:val="0"/>
+        <w:pageBreakBefore w:val="0"/>
+        <w:widowControl w:val="1"/>
+        <w:pBdr>
+          <w:top w:space="0" w:sz="0" w:val="nil"/>
+          <w:left w:space="0" w:sz="0" w:val="nil"/>
+          <w:bottom w:space="0" w:sz="0" w:val="nil"/>
+          <w:right w:space="0" w:sz="0" w:val="nil"/>
+          <w:between w:space="0" w:sz="0" w:val="nil"/>
+        </w:pBdr>
+        <w:shd w:fill="auto" w:val="clear"/>
+        <w:spacing w:after="60" w:before="120" w:line="276" w:lineRule="auto"/>
+        <w:ind w:left="0" w:right="0" w:firstLine="0"/>
+        <w:jc w:val="left"/>
+        <w:rPr>
+          <w:rFonts w:ascii="Times New Roman" w:cs="Times New Roman" w:eastAsia="Times New Roman" w:hAnsi="Times New Roman"/>
+          <w:sz w:val="24"/>
+          <w:szCs w:val="24"/>
+        </w:rPr>
+      </w:pPr>
+      <w:r>
+        <w:rPr>
+          <w:rFonts w:ascii="Times New Roman" w:cs="Times New Roman" w:eastAsia="Times New Roman" w:hAnsi="Times New Roman"/>
+          <w:sz w:val="24"/>
+          <w:szCs w:val="24"/>
+          <w:rtl w:val="0"/>
+        </w:rPr>
+        <w:t xml:space="preserve">A projekt fejlesztése során sikerült egy komplex, többplatformos alkalmazásrendszert létrehozni, amely különböző technológiák együttműködésére épül.</w:t>
+      </w:r>
+    </w:p>
+    <w:p>
+      <w:pPr>
+        <w:keepNext w:val="0"/>
+        <w:keepLines w:val="0"/>
+        <w:pageBreakBefore w:val="0"/>
+        <w:widowControl w:val="1"/>
+        <w:pBdr>
+          <w:top w:space="0" w:sz="0" w:val="nil"/>
+          <w:left w:space="0" w:sz="0" w:val="nil"/>
+          <w:bottom w:space="0" w:sz="0" w:val="nil"/>
+          <w:right w:space="0" w:sz="0" w:val="nil"/>
+          <w:between w:space="0" w:sz="0" w:val="nil"/>
+        </w:pBdr>
+        <w:shd w:fill="auto" w:val="clear"/>
+        <w:spacing w:after="60" w:before="120" w:line="276" w:lineRule="auto"/>
+        <w:ind w:left="0" w:right="0" w:firstLine="0"/>
+        <w:jc w:val="left"/>
+        <w:rPr>
+          <w:rFonts w:ascii="Times New Roman" w:cs="Times New Roman" w:eastAsia="Times New Roman" w:hAnsi="Times New Roman"/>
+          <w:sz w:val="24"/>
+          <w:szCs w:val="24"/>
+        </w:rPr>
+      </w:pPr>
+      <w:r>
+        <w:rPr>
+          <w:rFonts w:ascii="Times New Roman" w:cs="Times New Roman" w:eastAsia="Times New Roman" w:hAnsi="Times New Roman"/>
+          <w:sz w:val="24"/>
+          <w:szCs w:val="24"/>
+          <w:rtl w:val="0"/>
+        </w:rPr>
+        <w:t xml:space="preserve">A Royal Delivery nem csupán egy vizsgaprojekt, hanem egy olyan szakmai eredmény, amely mutatja a csapatunk fejlődését, és képességeit szoftverfejlesztés területén.</w:t>
       </w:r>
     </w:p>
     <w:p>
@@ -12792,8 +12694,8 @@
           <w:szCs w:val="24"/>
         </w:rPr>
       </w:pPr>
-      <w:bookmarkStart w:colFirst="0" w:colLast="0" w:name="_heading=h.pwxlsxvos9nk" w:id="62"/>
-      <w:bookmarkEnd w:id="62"/>
+      <w:bookmarkStart w:colFirst="0" w:colLast="0" w:name="_heading=h.pwxlsxvos9nk" w:id="57"/>
+      <w:bookmarkEnd w:id="57"/>
       <w:r>
         <w:rPr>
           <w:sz w:val="24"/>
@@ -12830,7 +12732,7 @@
         </w:rPr>
         <w:t xml:space="preserve">A projekt fejlesztése során több mesterséges intelligencia alapú eszközt is használtunk, amelyek különböző feladatok támogatására szolgáltak, elsősorban kiegészítő jelleggel, a fejlesztői munka hatékonyságának növelése érdekében. A Claude AI modellt elsősorban kódgenerálásra, komponensek és feature-ök felépítésének segítésére használtuk, főleg a frontend és backend komponensek és feature-ök gyors demózhatósága végett. A Google Gemini-t kreatív ötletelésre, UI/UX koncepciók és rendszertervezési irányok kidolgozására alkalmaztuk. A ChatGPT-t általános fejlesztési problémák megoldására, hibakeresésre, magyarázatokra és mindennapi fejlesztési feladatok támogatására használtuk. A Visual Studio Code környezetben a GitHub Copilot ingyenes (alap) verzióját kódjavaslatokra és gyors kiegészítésekre használtuk. Emellett egyes csapattagok a </w:t>
       </w:r>
-      <w:hyperlink r:id="rId31">
+      <w:hyperlink r:id="rId32">
         <w:r>
           <w:rPr>
             <w:rFonts w:ascii="Times New Roman" w:cs="Times New Roman" w:eastAsia="Times New Roman" w:hAnsi="Times New Roman"/>
@@ -12897,8 +12799,8 @@
           <w:szCs w:val="24"/>
         </w:rPr>
       </w:pPr>
-      <w:bookmarkStart w:colFirst="0" w:colLast="0" w:name="_heading=h.ufnevq9rlykw" w:id="63"/>
-      <w:bookmarkEnd w:id="63"/>
+      <w:bookmarkStart w:colFirst="0" w:colLast="0" w:name="_heading=h.ufnevq9rlykw" w:id="58"/>
+      <w:bookmarkEnd w:id="58"/>
       <w:r>
         <w:rPr>
           <w:sz w:val="24"/>
@@ -12938,7 +12840,7 @@
           <w:szCs w:val="24"/>
           <w:rtl w:val="0"/>
         </w:rPr>
-        <w:t xml:space="preserve">A projekt kizárólag a vizsgaremekhez készült és még nem lett bemutatva sehol sem</w:t>
+        <w:t xml:space="preserve">A projekt kizárólag a vizsgaremekhez készült és nem lett még bemutatva sehol máshol</w:t>
       </w:r>
       <w:r>
         <w:rPr>
@@ -12979,8 +12881,8 @@
           <w:highlight w:val="white"/>
         </w:rPr>
       </w:pPr>
-      <w:bookmarkStart w:colFirst="0" w:colLast="0" w:name="_heading=h.6m7tywned769" w:id="64"/>
-      <w:bookmarkEnd w:id="64"/>
+      <w:bookmarkStart w:colFirst="0" w:colLast="0" w:name="_heading=h.6m7tywned769" w:id="59"/>
+      <w:bookmarkEnd w:id="59"/>
       <w:r>
         <w:rPr>
           <w:b w:val="0"/>
@@ -12997,7 +12899,7 @@
       <w:pPr>
         <w:numPr>
           <w:ilvl w:val="0"/>
-          <w:numId w:val="16"/>
+          <w:numId w:val="15"/>
         </w:numPr>
         <w:spacing w:after="60" w:before="120" w:line="276" w:lineRule="auto"/>
         <w:ind w:left="720" w:hanging="360"/>
@@ -13018,7 +12920,7 @@
         </w:rPr>
         <w:t xml:space="preserve">Wolt. Hivatalos weboldal. Elérhető:</w:t>
       </w:r>
-      <w:hyperlink r:id="rId32">
+      <w:hyperlink r:id="rId33">
         <w:r>
           <w:rPr>
             <w:rFonts w:ascii="Times New Roman" w:cs="Times New Roman" w:eastAsia="Times New Roman" w:hAnsi="Times New Roman"/>
@@ -13029,7 +12931,7 @@
           <w:t xml:space="preserve"> </w:t>
         </w:r>
       </w:hyperlink>
-      <w:hyperlink r:id="rId33">
+      <w:hyperlink r:id="rId34">
         <w:r>
           <w:rPr>
             <w:rFonts w:ascii="Times New Roman" w:cs="Times New Roman" w:eastAsia="Times New Roman" w:hAnsi="Times New Roman"/>
@@ -13056,7 +12958,7 @@
       <w:pPr>
         <w:numPr>
           <w:ilvl w:val="0"/>
-          <w:numId w:val="16"/>
+          <w:numId w:val="15"/>
         </w:numPr>
         <w:spacing w:after="60" w:before="120" w:line="276" w:lineRule="auto"/>
         <w:ind w:left="720" w:hanging="360"/>
@@ -13077,7 +12979,7 @@
         </w:rPr>
         <w:t xml:space="preserve">Foodora. Hivatalos weboldal. Elérhető:</w:t>
       </w:r>
-      <w:hyperlink r:id="rId34">
+      <w:hyperlink r:id="rId35">
         <w:r>
           <w:rPr>
             <w:rFonts w:ascii="Times New Roman" w:cs="Times New Roman" w:eastAsia="Times New Roman" w:hAnsi="Times New Roman"/>
@@ -13088,7 +12990,7 @@
           <w:t xml:space="preserve"> </w:t>
         </w:r>
       </w:hyperlink>
-      <w:hyperlink r:id="rId35">
+      <w:hyperlink r:id="rId36">
         <w:r>
           <w:rPr>
             <w:rFonts w:ascii="Times New Roman" w:cs="Times New Roman" w:eastAsia="Times New Roman" w:hAnsi="Times New Roman"/>
@@ -13115,7 +13017,7 @@
       <w:pPr>
         <w:numPr>
           <w:ilvl w:val="0"/>
-          <w:numId w:val="16"/>
+          <w:numId w:val="15"/>
         </w:numPr>
         <w:spacing w:after="60" w:before="120" w:line="276" w:lineRule="auto"/>
         <w:ind w:left="720" w:hanging="360"/>
@@ -13136,7 +13038,7 @@
         </w:rPr>
         <w:t xml:space="preserve">Bolt Food. Hivatalos weboldal. Elérhető:</w:t>
       </w:r>
-      <w:hyperlink r:id="rId36">
+      <w:hyperlink r:id="rId37">
         <w:r>
           <w:rPr>
             <w:rFonts w:ascii="Times New Roman" w:cs="Times New Roman" w:eastAsia="Times New Roman" w:hAnsi="Times New Roman"/>
@@ -13147,7 +13049,7 @@
           <w:t xml:space="preserve"> </w:t>
         </w:r>
       </w:hyperlink>
-      <w:hyperlink r:id="rId37">
+      <w:hyperlink r:id="rId38">
         <w:r>
           <w:rPr>
             <w:rFonts w:ascii="Times New Roman" w:cs="Times New Roman" w:eastAsia="Times New Roman" w:hAnsi="Times New Roman"/>
@@ -13174,7 +13076,7 @@
       <w:pPr>
         <w:numPr>
           <w:ilvl w:val="0"/>
-          <w:numId w:val="16"/>
+          <w:numId w:val="15"/>
         </w:numPr>
         <w:spacing w:after="60" w:before="120" w:line="276" w:lineRule="auto"/>
         <w:ind w:left="720" w:hanging="360"/>
@@ -13195,7 +13097,7 @@
         </w:rPr>
         <w:t xml:space="preserve">Deliveo. Hivatalos weboldal. Elérhető: </w:t>
       </w:r>
-      <w:hyperlink r:id="rId38">
+      <w:hyperlink r:id="rId39">
         <w:r>
           <w:rPr>
             <w:rFonts w:ascii="Times New Roman" w:cs="Times New Roman" w:eastAsia="Times New Roman" w:hAnsi="Times New Roman"/>
@@ -13222,7 +13124,7 @@
       <w:pPr>
         <w:numPr>
           <w:ilvl w:val="0"/>
-          <w:numId w:val="16"/>
+          <w:numId w:val="15"/>
         </w:numPr>
         <w:spacing w:after="60" w:before="120" w:line="276" w:lineRule="auto"/>
         <w:ind w:left="720" w:hanging="360"/>
@@ -13243,7 +13145,7 @@
         </w:rPr>
         <w:t xml:space="preserve">Uber Eats. Hivatalos weboldal. Elérhető:</w:t>
       </w:r>
-      <w:hyperlink r:id="rId39">
+      <w:hyperlink r:id="rId40">
         <w:r>
           <w:rPr>
             <w:rFonts w:ascii="Times New Roman" w:cs="Times New Roman" w:eastAsia="Times New Roman" w:hAnsi="Times New Roman"/>
@@ -13254,7 +13156,7 @@
           <w:t xml:space="preserve"> </w:t>
         </w:r>
       </w:hyperlink>
-      <w:hyperlink r:id="rId40">
+      <w:hyperlink r:id="rId41">
         <w:r>
           <w:rPr>
             <w:rFonts w:ascii="Times New Roman" w:cs="Times New Roman" w:eastAsia="Times New Roman" w:hAnsi="Times New Roman"/>
@@ -13281,7 +13183,7 @@
       <w:pPr>
         <w:numPr>
           <w:ilvl w:val="0"/>
-          <w:numId w:val="16"/>
+          <w:numId w:val="15"/>
         </w:numPr>
         <w:spacing w:after="60" w:before="120" w:line="276" w:lineRule="auto"/>
         <w:ind w:left="720" w:hanging="360"/>
@@ -13302,7 +13204,7 @@
         </w:rPr>
         <w:t xml:space="preserve">DoorDash. Hivatalos weboldal. Elérhető:</w:t>
       </w:r>
-      <w:hyperlink r:id="rId41">
+      <w:hyperlink r:id="rId42">
         <w:r>
           <w:rPr>
             <w:rFonts w:ascii="Times New Roman" w:cs="Times New Roman" w:eastAsia="Times New Roman" w:hAnsi="Times New Roman"/>
@@ -13313,7 +13215,7 @@
           <w:t xml:space="preserve"> </w:t>
         </w:r>
       </w:hyperlink>
-      <w:hyperlink r:id="rId42">
+      <w:hyperlink r:id="rId43">
         <w:r>
           <w:rPr>
             <w:rFonts w:ascii="Times New Roman" w:cs="Times New Roman" w:eastAsia="Times New Roman" w:hAnsi="Times New Roman"/>
@@ -13340,7 +13242,7 @@
       <w:pPr>
         <w:numPr>
           <w:ilvl w:val="0"/>
-          <w:numId w:val="16"/>
+          <w:numId w:val="15"/>
         </w:numPr>
         <w:spacing w:after="60" w:before="120" w:line="276" w:lineRule="auto"/>
         <w:ind w:left="720" w:hanging="360"/>
@@ -13361,7 +13263,7 @@
         </w:rPr>
         <w:t xml:space="preserve">Supabase. Hivatalos dokumentáció. Elérhető:</w:t>
       </w:r>
-      <w:hyperlink r:id="rId43">
+      <w:hyperlink r:id="rId44">
         <w:r>
           <w:rPr>
             <w:rFonts w:ascii="Times New Roman" w:cs="Times New Roman" w:eastAsia="Times New Roman" w:hAnsi="Times New Roman"/>
@@ -13372,7 +13274,7 @@
           <w:t xml:space="preserve"> </w:t>
         </w:r>
       </w:hyperlink>
-      <w:hyperlink r:id="rId44">
+      <w:hyperlink r:id="rId45">
         <w:r>
           <w:rPr>
             <w:rFonts w:ascii="Times New Roman" w:cs="Times New Roman" w:eastAsia="Times New Roman" w:hAnsi="Times New Roman"/>
@@ -13399,7 +13301,7 @@
       <w:pPr>
         <w:numPr>
           <w:ilvl w:val="0"/>
-          <w:numId w:val="16"/>
+          <w:numId w:val="15"/>
         </w:numPr>
         <w:spacing w:after="60" w:before="120" w:line="276" w:lineRule="auto"/>
         <w:ind w:left="720" w:hanging="360"/>
@@ -13420,7 +13322,7 @@
         </w:rPr>
         <w:t xml:space="preserve">Node.js. Hivatalos dokumentáció. Elérhető:</w:t>
       </w:r>
-      <w:hyperlink r:id="rId45">
+      <w:hyperlink r:id="rId46">
         <w:r>
           <w:rPr>
             <w:rFonts w:ascii="Times New Roman" w:cs="Times New Roman" w:eastAsia="Times New Roman" w:hAnsi="Times New Roman"/>
@@ -13431,7 +13333,7 @@
           <w:t xml:space="preserve"> </w:t>
         </w:r>
       </w:hyperlink>
-      <w:hyperlink r:id="rId46">
+      <w:hyperlink r:id="rId47">
         <w:r>
           <w:rPr>
             <w:rFonts w:ascii="Times New Roman" w:cs="Times New Roman" w:eastAsia="Times New Roman" w:hAnsi="Times New Roman"/>
@@ -13458,7 +13360,7 @@
       <w:pPr>
         <w:numPr>
           <w:ilvl w:val="0"/>
-          <w:numId w:val="16"/>
+          <w:numId w:val="15"/>
         </w:numPr>
         <w:spacing w:after="60" w:before="120" w:line="276" w:lineRule="auto"/>
         <w:ind w:left="720" w:hanging="360"/>
@@ -13479,7 +13381,7 @@
         </w:rPr>
         <w:t xml:space="preserve">React. Hivatalos dokumentáció. Elérhető:</w:t>
       </w:r>
-      <w:hyperlink r:id="rId47">
+      <w:hyperlink r:id="rId48">
         <w:r>
           <w:rPr>
             <w:rFonts w:ascii="Times New Roman" w:cs="Times New Roman" w:eastAsia="Times New Roman" w:hAnsi="Times New Roman"/>
@@ -13490,7 +13392,7 @@
           <w:t xml:space="preserve"> </w:t>
         </w:r>
       </w:hyperlink>
-      <w:hyperlink r:id="rId48">
+      <w:hyperlink r:id="rId49">
         <w:r>
           <w:rPr>
             <w:rFonts w:ascii="Times New Roman" w:cs="Times New Roman" w:eastAsia="Times New Roman" w:hAnsi="Times New Roman"/>
@@ -13517,7 +13419,7 @@
       <w:pPr>
         <w:numPr>
           <w:ilvl w:val="0"/>
-          <w:numId w:val="16"/>
+          <w:numId w:val="15"/>
         </w:numPr>
         <w:spacing w:after="60" w:before="120" w:line="276" w:lineRule="auto"/>
         <w:ind w:left="720" w:hanging="360"/>
@@ -13538,7 +13440,7 @@
         </w:rPr>
         <w:t xml:space="preserve">Vue.js. Hivatalos dokumentáció. Elérhető:</w:t>
       </w:r>
-      <w:hyperlink r:id="rId49">
+      <w:hyperlink r:id="rId50">
         <w:r>
           <w:rPr>
             <w:rFonts w:ascii="Times New Roman" w:cs="Times New Roman" w:eastAsia="Times New Roman" w:hAnsi="Times New Roman"/>
@@ -13549,7 +13451,7 @@
           <w:t xml:space="preserve"> </w:t>
         </w:r>
       </w:hyperlink>
-      <w:hyperlink r:id="rId50">
+      <w:hyperlink r:id="rId51">
         <w:r>
           <w:rPr>
             <w:rFonts w:ascii="Times New Roman" w:cs="Times New Roman" w:eastAsia="Times New Roman" w:hAnsi="Times New Roman"/>
@@ -13576,7 +13478,7 @@
       <w:pPr>
         <w:numPr>
           <w:ilvl w:val="0"/>
-          <w:numId w:val="16"/>
+          <w:numId w:val="15"/>
         </w:numPr>
         <w:spacing w:after="60" w:before="120" w:line="276" w:lineRule="auto"/>
         <w:ind w:left="720" w:hanging="360"/>
@@ -13597,7 +13499,7 @@
         </w:rPr>
         <w:t xml:space="preserve">Expo. Hivatalos dokumentáció. Elérhető:</w:t>
       </w:r>
-      <w:hyperlink r:id="rId51">
+      <w:hyperlink r:id="rId52">
         <w:r>
           <w:rPr>
             <w:rFonts w:ascii="Times New Roman" w:cs="Times New Roman" w:eastAsia="Times New Roman" w:hAnsi="Times New Roman"/>
@@ -13608,7 +13510,7 @@
           <w:t xml:space="preserve"> </w:t>
         </w:r>
       </w:hyperlink>
-      <w:hyperlink r:id="rId52">
+      <w:hyperlink r:id="rId53">
         <w:r>
           <w:rPr>
             <w:rFonts w:ascii="Times New Roman" w:cs="Times New Roman" w:eastAsia="Times New Roman" w:hAnsi="Times New Roman"/>
@@ -13635,7 +13537,7 @@
       <w:pPr>
         <w:numPr>
           <w:ilvl w:val="0"/>
-          <w:numId w:val="16"/>
+          <w:numId w:val="15"/>
         </w:numPr>
         <w:spacing w:after="60" w:before="120" w:line="276" w:lineRule="auto"/>
         <w:ind w:left="720" w:hanging="360"/>
@@ -13656,7 +13558,7 @@
         </w:rPr>
         <w:t xml:space="preserve">Microsoft. Windows Presentation Foundation dokumentáció. Elérhető:</w:t>
       </w:r>
-      <w:hyperlink r:id="rId53">
+      <w:hyperlink r:id="rId54">
         <w:r>
           <w:rPr>
             <w:rFonts w:ascii="Times New Roman" w:cs="Times New Roman" w:eastAsia="Times New Roman" w:hAnsi="Times New Roman"/>
@@ -13667,7 +13569,7 @@
           <w:t xml:space="preserve"> </w:t>
         </w:r>
       </w:hyperlink>
-      <w:hyperlink r:id="rId54">
+      <w:hyperlink r:id="rId55">
         <w:r>
           <w:rPr>
             <w:rFonts w:ascii="Times New Roman" w:cs="Times New Roman" w:eastAsia="Times New Roman" w:hAnsi="Times New Roman"/>
@@ -13694,7 +13596,7 @@
       <w:pPr>
         <w:numPr>
           <w:ilvl w:val="0"/>
-          <w:numId w:val="16"/>
+          <w:numId w:val="15"/>
         </w:numPr>
         <w:spacing w:after="60" w:before="120" w:line="276" w:lineRule="auto"/>
         <w:ind w:left="720" w:hanging="360"/>
@@ -13744,8 +13646,8 @@
           <w:highlight w:val="white"/>
         </w:rPr>
       </w:pPr>
-      <w:bookmarkStart w:colFirst="0" w:colLast="0" w:name="_heading=h.kukkpswtryzq" w:id="65"/>
-      <w:bookmarkEnd w:id="65"/>
+      <w:bookmarkStart w:colFirst="0" w:colLast="0" w:name="_heading=h.kukkpswtryzq" w:id="60"/>
+      <w:bookmarkEnd w:id="60"/>
       <w:r>
         <w:rPr>
           <w:b w:val="0"/>
@@ -13796,10 +13698,10 @@
       </w:r>
     </w:p>
     <w:sectPr>
-      <w:headerReference r:id="rId55" w:type="default"/>
-      <w:headerReference r:id="rId56" w:type="even"/>
-      <w:footerReference r:id="rId57" w:type="default"/>
-      <w:footerReference r:id="rId58" w:type="even"/>
+      <w:headerReference r:id="rId56" w:type="default"/>
+      <w:headerReference r:id="rId57" w:type="even"/>
+      <w:footerReference r:id="rId58" w:type="default"/>
+      <w:footerReference r:id="rId59" w:type="even"/>
       <w:type w:val="nextPage"/>
       <w:pgSz w:h="16838" w:w="11906" w:orient="portrait"/>
       <w:pgMar w:bottom="1418" w:top="1418" w:left="1418" w:right="1418" w:header="510" w:footer="680"/>
@@ -15832,201 +15734,183 @@
   <w:abstractNum w:abstractNumId="15">
     <w:lvl w:ilvl="0">
       <w:start w:val="1"/>
-      <w:numFmt w:val="bullet"/>
-      <w:lvlText w:val="●"/>
+      <w:numFmt w:val="decimal"/>
+      <w:lvlText w:val="[%1]"/>
       <w:lvlJc w:val="left"/>
       <w:pPr>
         <w:ind w:left="720" w:hanging="360"/>
       </w:pPr>
-      <w:rPr>
-        <w:u w:val="none"/>
-      </w:rPr>
+      <w:rPr/>
     </w:lvl>
     <w:lvl w:ilvl="1">
       <w:start w:val="1"/>
-      <w:numFmt w:val="bullet"/>
-      <w:lvlText w:val="○"/>
+      <w:numFmt w:val="lowerLetter"/>
+      <w:lvlText w:val="%2."/>
       <w:lvlJc w:val="left"/>
       <w:pPr>
         <w:ind w:left="1440" w:hanging="360"/>
       </w:pPr>
-      <w:rPr>
-        <w:u w:val="none"/>
-      </w:rPr>
+      <w:rPr/>
     </w:lvl>
     <w:lvl w:ilvl="2">
       <w:start w:val="1"/>
-      <w:numFmt w:val="bullet"/>
-      <w:lvlText w:val="■"/>
-      <w:lvlJc w:val="left"/>
-      <w:pPr>
-        <w:ind w:left="2160" w:hanging="360"/>
-      </w:pPr>
-      <w:rPr>
-        <w:u w:val="none"/>
-      </w:rPr>
+      <w:numFmt w:val="lowerRoman"/>
+      <w:lvlText w:val="%3."/>
+      <w:lvlJc w:val="right"/>
+      <w:pPr>
+        <w:ind w:left="2160" w:hanging="180"/>
+      </w:pPr>
+      <w:rPr/>
     </w:lvl>
     <w:lvl w:ilvl="3">
       <w:start w:val="1"/>
-      <w:numFmt w:val="bullet"/>
-      <w:lvlText w:val="●"/>
+      <w:numFmt w:val="decimal"/>
+      <w:lvlText w:val="%4."/>
       <w:lvlJc w:val="left"/>
       <w:pPr>
         <w:ind w:left="2880" w:hanging="360"/>
       </w:pPr>
-      <w:rPr>
-        <w:u w:val="none"/>
-      </w:rPr>
+      <w:rPr/>
     </w:lvl>
     <w:lvl w:ilvl="4">
       <w:start w:val="1"/>
-      <w:numFmt w:val="bullet"/>
-      <w:lvlText w:val="○"/>
+      <w:numFmt w:val="lowerLetter"/>
+      <w:lvlText w:val="%5."/>
       <w:lvlJc w:val="left"/>
       <w:pPr>
         <w:ind w:left="3600" w:hanging="360"/>
       </w:pPr>
-      <w:rPr>
-        <w:u w:val="none"/>
-      </w:rPr>
+      <w:rPr/>
     </w:lvl>
     <w:lvl w:ilvl="5">
       <w:start w:val="1"/>
-      <w:numFmt w:val="bullet"/>
-      <w:lvlText w:val="■"/>
-      <w:lvlJc w:val="left"/>
-      <w:pPr>
-        <w:ind w:left="4320" w:hanging="360"/>
-      </w:pPr>
-      <w:rPr>
-        <w:u w:val="none"/>
-      </w:rPr>
+      <w:numFmt w:val="lowerRoman"/>
+      <w:lvlText w:val="%6."/>
+      <w:lvlJc w:val="right"/>
+      <w:pPr>
+        <w:ind w:left="4320" w:hanging="180"/>
+      </w:pPr>
+      <w:rPr/>
     </w:lvl>
     <w:lvl w:ilvl="6">
       <w:start w:val="1"/>
-      <w:numFmt w:val="bullet"/>
-      <w:lvlText w:val="●"/>
+      <w:numFmt w:val="decimal"/>
+      <w:lvlText w:val="%7."/>
       <w:lvlJc w:val="left"/>
       <w:pPr>
         <w:ind w:left="5040" w:hanging="360"/>
       </w:pPr>
-      <w:rPr>
-        <w:u w:val="none"/>
-      </w:rPr>
+      <w:rPr/>
     </w:lvl>
     <w:lvl w:ilvl="7">
       <w:start w:val="1"/>
-      <w:numFmt w:val="bullet"/>
-      <w:lvlText w:val="○"/>
+      <w:numFmt w:val="lowerLetter"/>
+      <w:lvlText w:val="%8."/>
       <w:lvlJc w:val="left"/>
       <w:pPr>
         <w:ind w:left="5760" w:hanging="360"/>
       </w:pPr>
-      <w:rPr>
-        <w:u w:val="none"/>
-      </w:rPr>
+      <w:rPr/>
     </w:lvl>
     <w:lvl w:ilvl="8">
       <w:start w:val="1"/>
-      <w:numFmt w:val="bullet"/>
-      <w:lvlText w:val="■"/>
-      <w:lvlJc w:val="left"/>
-      <w:pPr>
-        <w:ind w:left="6480" w:hanging="360"/>
-      </w:pPr>
-      <w:rPr>
-        <w:u w:val="none"/>
-      </w:rPr>
+      <w:numFmt w:val="lowerRoman"/>
+      <w:lvlText w:val="%9."/>
+      <w:lvlJc w:val="right"/>
+      <w:pPr>
+        <w:ind w:left="6480" w:hanging="180"/>
+      </w:pPr>
+      <w:rPr/>
     </w:lvl>
   </w:abstractNum>
   <w:abstractNum w:abstractNumId="16">
     <w:lvl w:ilvl="0">
       <w:start w:val="1"/>
       <w:numFmt w:val="decimal"/>
-      <w:lvlText w:val="[%1]"/>
-      <w:lvlJc w:val="left"/>
-      <w:pPr>
-        <w:ind w:left="720" w:hanging="360"/>
+      <w:lvlText w:val="%1."/>
+      <w:lvlJc w:val="left"/>
+      <w:pPr>
+        <w:ind w:left="360" w:hanging="360"/>
       </w:pPr>
       <w:rPr/>
     </w:lvl>
     <w:lvl w:ilvl="1">
       <w:start w:val="1"/>
-      <w:numFmt w:val="lowerLetter"/>
-      <w:lvlText w:val="%2."/>
-      <w:lvlJc w:val="left"/>
-      <w:pPr>
-        <w:ind w:left="1440" w:hanging="360"/>
+      <w:numFmt w:val="decimal"/>
+      <w:lvlText w:val="%1.%2"/>
+      <w:lvlJc w:val="left"/>
+      <w:pPr>
+        <w:ind w:left="576" w:hanging="576"/>
       </w:pPr>
       <w:rPr/>
     </w:lvl>
     <w:lvl w:ilvl="2">
       <w:start w:val="1"/>
-      <w:numFmt w:val="lowerRoman"/>
-      <w:lvlText w:val="%3."/>
-      <w:lvlJc w:val="right"/>
-      <w:pPr>
-        <w:ind w:left="2160" w:hanging="180"/>
+      <w:numFmt w:val="decimal"/>
+      <w:lvlText w:val="%1.%2.%3"/>
+      <w:lvlJc w:val="left"/>
+      <w:pPr>
+        <w:ind w:left="720" w:hanging="720"/>
       </w:pPr>
       <w:rPr/>
     </w:lvl>
     <w:lvl w:ilvl="3">
       <w:start w:val="1"/>
       <w:numFmt w:val="decimal"/>
-      <w:lvlText w:val="%4."/>
-      <w:lvlJc w:val="left"/>
-      <w:pPr>
-        <w:ind w:left="2880" w:hanging="360"/>
+      <w:lvlText w:val="%1.%2.%3.%4"/>
+      <w:lvlJc w:val="left"/>
+      <w:pPr>
+        <w:ind w:left="864" w:hanging="864"/>
       </w:pPr>
       <w:rPr/>
     </w:lvl>
     <w:lvl w:ilvl="4">
       <w:start w:val="1"/>
-      <w:numFmt w:val="lowerLetter"/>
-      <w:lvlText w:val="%5."/>
-      <w:lvlJc w:val="left"/>
-      <w:pPr>
-        <w:ind w:left="3600" w:hanging="360"/>
+      <w:numFmt w:val="decimal"/>
+      <w:lvlText w:val="%1.%2.%3.%4.%5"/>
+      <w:lvlJc w:val="left"/>
+      <w:pPr>
+        <w:ind w:left="1008" w:hanging="1008"/>
       </w:pPr>
       <w:rPr/>
     </w:lvl>
     <w:lvl w:ilvl="5">
       <w:start w:val="1"/>
-      <w:numFmt w:val="lowerRoman"/>
-      <w:lvlText w:val="%6."/>
-      <w:lvlJc w:val="right"/>
-      <w:pPr>
-        <w:ind w:left="4320" w:hanging="180"/>
+      <w:numFmt w:val="decimal"/>
+      <w:lvlText w:val="%1.%2.%3.%4.%5.%6"/>
+      <w:lvlJc w:val="left"/>
+      <w:pPr>
+        <w:ind w:left="1152" w:hanging="1152"/>
       </w:pPr>
       <w:rPr/>
     </w:lvl>
     <w:lvl w:ilvl="6">
       <w:start w:val="1"/>
       <w:numFmt w:val="decimal"/>
-      <w:lvlText w:val="%7."/>
-      <w:lvlJc w:val="left"/>
-      <w:pPr>
-        <w:ind w:left="5040" w:hanging="360"/>
+      <w:lvlText w:val="%1.%2.%3.%4.%5.%6.%7"/>
+      <w:lvlJc w:val="left"/>
+      <w:pPr>
+        <w:ind w:left="1296" w:hanging="1296"/>
       </w:pPr>
       <w:rPr/>
     </w:lvl>
     <w:lvl w:ilvl="7">
       <w:start w:val="1"/>
-      <w:numFmt w:val="lowerLetter"/>
-      <w:lvlText w:val="%8."/>
-      <w:lvlJc w:val="left"/>
-      <w:pPr>
-        <w:ind w:left="5760" w:hanging="360"/>
+      <w:numFmt w:val="decimal"/>
+      <w:lvlText w:val="%1.%2.%3.%4.%5.%6.%7.%8"/>
+      <w:lvlJc w:val="left"/>
+      <w:pPr>
+        <w:ind w:left="1440" w:hanging="1440"/>
       </w:pPr>
       <w:rPr/>
     </w:lvl>
     <w:lvl w:ilvl="8">
       <w:start w:val="1"/>
-      <w:numFmt w:val="lowerRoman"/>
-      <w:lvlText w:val="%9."/>
-      <w:lvlJc w:val="right"/>
-      <w:pPr>
-        <w:ind w:left="6480" w:hanging="180"/>
+      <w:numFmt w:val="decimal"/>
+      <w:lvlText w:val="%1.%2.%3.%4.%5.%6.%7.%8.%9"/>
+      <w:lvlJc w:val="left"/>
+      <w:pPr>
+        <w:ind w:left="1584" w:hanging="1584"/>
       </w:pPr>
       <w:rPr/>
     </w:lvl>
@@ -16034,93 +15918,111 @@
   <w:abstractNum w:abstractNumId="17">
     <w:lvl w:ilvl="0">
       <w:start w:val="1"/>
-      <w:numFmt w:val="decimal"/>
-      <w:lvlText w:val="%1."/>
-      <w:lvlJc w:val="left"/>
-      <w:pPr>
-        <w:ind w:left="360" w:hanging="360"/>
-      </w:pPr>
-      <w:rPr/>
+      <w:numFmt w:val="bullet"/>
+      <w:lvlText w:val="●"/>
+      <w:lvlJc w:val="left"/>
+      <w:pPr>
+        <w:ind w:left="720" w:hanging="360"/>
+      </w:pPr>
+      <w:rPr>
+        <w:u w:val="none"/>
+      </w:rPr>
     </w:lvl>
     <w:lvl w:ilvl="1">
       <w:start w:val="1"/>
-      <w:numFmt w:val="decimal"/>
-      <w:lvlText w:val="%1.%2"/>
-      <w:lvlJc w:val="left"/>
-      <w:pPr>
-        <w:ind w:left="576" w:hanging="576"/>
-      </w:pPr>
-      <w:rPr/>
+      <w:numFmt w:val="bullet"/>
+      <w:lvlText w:val="○"/>
+      <w:lvlJc w:val="left"/>
+      <w:pPr>
+        <w:ind w:left="1440" w:hanging="360"/>
+      </w:pPr>
+      <w:rPr>
+        <w:u w:val="none"/>
+      </w:rPr>
     </w:lvl>
     <w:lvl w:ilvl="2">
       <w:start w:val="1"/>
-      <w:numFmt w:val="decimal"/>
-      <w:lvlText w:val="%1.%2.%3"/>
-      <w:lvlJc w:val="left"/>
-      <w:pPr>
-        <w:ind w:left="720" w:hanging="720"/>
-      </w:pPr>
-      <w:rPr/>
+      <w:numFmt w:val="bullet"/>
+      <w:lvlText w:val="■"/>
+      <w:lvlJc w:val="left"/>
+      <w:pPr>
+        <w:ind w:left="2160" w:hanging="360"/>
+      </w:pPr>
+      <w:rPr>
+        <w:u w:val="none"/>
+      </w:rPr>
     </w:lvl>
     <w:lvl w:ilvl="3">
       <w:start w:val="1"/>
-      <w:numFmt w:val="decimal"/>
-      <w:lvlText w:val="%1.%2.%3.%4"/>
-      <w:lvlJc w:val="left"/>
-      <w:pPr>
-        <w:ind w:left="864" w:hanging="864"/>
-      </w:pPr>
-      <w:rPr/>
+      <w:numFmt w:val="bullet"/>
+      <w:lvlText w:val="●"/>
+      <w:lvlJc w:val="left"/>
+      <w:pPr>
+        <w:ind w:left="2880" w:hanging="360"/>
+      </w:pPr>
+      <w:rPr>
+        <w:u w:val="none"/>
+      </w:rPr>
     </w:lvl>
     <w:lvl w:ilvl="4">
       <w:start w:val="1"/>
-      <w:numFmt w:val="decimal"/>
-      <w:lvlText w:val="%1.%2.%3.%4.%5"/>
-      <w:lvlJc w:val="left"/>
-      <w:pPr>
-        <w:ind w:left="1008" w:hanging="1008"/>
-      </w:pPr>
-      <w:rPr/>
+      <w:numFmt w:val="bullet"/>
+      <w:lvlText w:val="○"/>
+      <w:lvlJc w:val="left"/>
+      <w:pPr>
+        <w:ind w:left="3600" w:hanging="360"/>
+      </w:pPr>
+      <w:rPr>
+        <w:u w:val="none"/>
+      </w:rPr>
     </w:lvl>
     <w:lvl w:ilvl="5">
       <w:start w:val="1"/>
-      <w:numFmt w:val="decimal"/>
-      <w:lvlText w:val="%1.%2.%3.%4.%5.%6"/>
-      <w:lvlJc w:val="left"/>
-      <w:pPr>
-        <w:ind w:left="1152" w:hanging="1152"/>
-      </w:pPr>
-      <w:rPr/>
+      <w:numFmt w:val="bullet"/>
+      <w:lvlText w:val="■"/>
+      <w:lvlJc w:val="left"/>
+      <w:pPr>
+        <w:ind w:left="4320" w:hanging="360"/>
+      </w:pPr>
+      <w:rPr>
+        <w:u w:val="none"/>
+      </w:rPr>
     </w:lvl>
     <w:lvl w:ilvl="6">
       <w:start w:val="1"/>
-      <w:numFmt w:val="decimal"/>
-      <w:lvlText w:val="%1.%2.%3.%4.%5.%6.%7"/>
-      <w:lvlJc w:val="left"/>
-      <w:pPr>
-        <w:ind w:left="1296" w:hanging="1296"/>
-      </w:pPr>
-      <w:rPr/>
+      <w:numFmt w:val="bullet"/>
+      <w:lvlText w:val="●"/>
+      <w:lvlJc w:val="left"/>
+      <w:pPr>
+        <w:ind w:left="5040" w:hanging="360"/>
+      </w:pPr>
+      <w:rPr>
+        <w:u w:val="none"/>
+      </w:rPr>
     </w:lvl>
     <w:lvl w:ilvl="7">
       <w:start w:val="1"/>
-      <w:numFmt w:val="decimal"/>
-      <w:lvlText w:val="%1.%2.%3.%4.%5.%6.%7.%8"/>
-      <w:lvlJc w:val="left"/>
-      <w:pPr>
-        <w:ind w:left="1440" w:hanging="1440"/>
-      </w:pPr>
-      <w:rPr/>
+      <w:numFmt w:val="bullet"/>
+      <w:lvlText w:val="○"/>
+      <w:lvlJc w:val="left"/>
+      <w:pPr>
+        <w:ind w:left="5760" w:hanging="360"/>
+      </w:pPr>
+      <w:rPr>
+        <w:u w:val="none"/>
+      </w:rPr>
     </w:lvl>
     <w:lvl w:ilvl="8">
       <w:start w:val="1"/>
-      <w:numFmt w:val="decimal"/>
-      <w:lvlText w:val="%1.%2.%3.%4.%5.%6.%7.%8.%9"/>
-      <w:lvlJc w:val="left"/>
-      <w:pPr>
-        <w:ind w:left="1584" w:hanging="1584"/>
-      </w:pPr>
-      <w:rPr/>
+      <w:numFmt w:val="bullet"/>
+      <w:lvlText w:val="■"/>
+      <w:lvlJc w:val="left"/>
+      <w:pPr>
+        <w:ind w:left="6480" w:hanging="360"/>
+      </w:pPr>
+      <w:rPr>
+        <w:u w:val="none"/>
+      </w:rPr>
     </w:lvl>
   </w:abstractNum>
   <w:abstractNum w:abstractNumId="18">
@@ -17334,226 +17236,6 @@
     </w:lvl>
   </w:abstractNum>
   <w:abstractNum w:abstractNumId="29">
-    <w:lvl w:ilvl="0">
-      <w:start w:val="1"/>
-      <w:numFmt w:val="bullet"/>
-      <w:lvlText w:val="●"/>
-      <w:lvlJc w:val="left"/>
-      <w:pPr>
-        <w:ind w:left="720" w:hanging="360"/>
-      </w:pPr>
-      <w:rPr>
-        <w:u w:val="none"/>
-      </w:rPr>
-    </w:lvl>
-    <w:lvl w:ilvl="1">
-      <w:start w:val="1"/>
-      <w:numFmt w:val="bullet"/>
-      <w:lvlText w:val="○"/>
-      <w:lvlJc w:val="left"/>
-      <w:pPr>
-        <w:ind w:left="1440" w:hanging="360"/>
-      </w:pPr>
-      <w:rPr>
-        <w:u w:val="none"/>
-      </w:rPr>
-    </w:lvl>
-    <w:lvl w:ilvl="2">
-      <w:start w:val="1"/>
-      <w:numFmt w:val="bullet"/>
-      <w:lvlText w:val="■"/>
-      <w:lvlJc w:val="left"/>
-      <w:pPr>
-        <w:ind w:left="2160" w:hanging="360"/>
-      </w:pPr>
-      <w:rPr>
-        <w:u w:val="none"/>
-      </w:rPr>
-    </w:lvl>
-    <w:lvl w:ilvl="3">
-      <w:start w:val="1"/>
-      <w:numFmt w:val="bullet"/>
-      <w:lvlText w:val="●"/>
-      <w:lvlJc w:val="left"/>
-      <w:pPr>
-        <w:ind w:left="2880" w:hanging="360"/>
-      </w:pPr>
-      <w:rPr>
-        <w:u w:val="none"/>
-      </w:rPr>
-    </w:lvl>
-    <w:lvl w:ilvl="4">
-      <w:start w:val="1"/>
-      <w:numFmt w:val="bullet"/>
-      <w:lvlText w:val="○"/>
-      <w:lvlJc w:val="left"/>
-      <w:pPr>
-        <w:ind w:left="3600" w:hanging="360"/>
-      </w:pPr>
-      <w:rPr>
-        <w:u w:val="none"/>
-      </w:rPr>
-    </w:lvl>
-    <w:lvl w:ilvl="5">
-      <w:start w:val="1"/>
-      <w:numFmt w:val="bullet"/>
-      <w:lvlText w:val="■"/>
-      <w:lvlJc w:val="left"/>
-      <w:pPr>
-        <w:ind w:left="4320" w:hanging="360"/>
-      </w:pPr>
-      <w:rPr>
-        <w:u w:val="none"/>
-      </w:rPr>
-    </w:lvl>
-    <w:lvl w:ilvl="6">
-      <w:start w:val="1"/>
-      <w:numFmt w:val="bullet"/>
-      <w:lvlText w:val="●"/>
-      <w:lvlJc w:val="left"/>
-      <w:pPr>
-        <w:ind w:left="5040" w:hanging="360"/>
-      </w:pPr>
-      <w:rPr>
-        <w:u w:val="none"/>
-      </w:rPr>
-    </w:lvl>
-    <w:lvl w:ilvl="7">
-      <w:start w:val="1"/>
-      <w:numFmt w:val="bullet"/>
-      <w:lvlText w:val="○"/>
-      <w:lvlJc w:val="left"/>
-      <w:pPr>
-        <w:ind w:left="5760" w:hanging="360"/>
-      </w:pPr>
-      <w:rPr>
-        <w:u w:val="none"/>
-      </w:rPr>
-    </w:lvl>
-    <w:lvl w:ilvl="8">
-      <w:start w:val="1"/>
-      <w:numFmt w:val="bullet"/>
-      <w:lvlText w:val="■"/>
-      <w:lvlJc w:val="left"/>
-      <w:pPr>
-        <w:ind w:left="6480" w:hanging="360"/>
-      </w:pPr>
-      <w:rPr>
-        <w:u w:val="none"/>
-      </w:rPr>
-    </w:lvl>
-  </w:abstractNum>
-  <w:abstractNum w:abstractNumId="30">
-    <w:lvl w:ilvl="0">
-      <w:start w:val="1"/>
-      <w:numFmt w:val="bullet"/>
-      <w:lvlText w:val="●"/>
-      <w:lvlJc w:val="left"/>
-      <w:pPr>
-        <w:ind w:left="720" w:hanging="360"/>
-      </w:pPr>
-      <w:rPr>
-        <w:u w:val="none"/>
-      </w:rPr>
-    </w:lvl>
-    <w:lvl w:ilvl="1">
-      <w:start w:val="1"/>
-      <w:numFmt w:val="bullet"/>
-      <w:lvlText w:val="○"/>
-      <w:lvlJc w:val="left"/>
-      <w:pPr>
-        <w:ind w:left="1440" w:hanging="360"/>
-      </w:pPr>
-      <w:rPr>
-        <w:u w:val="none"/>
-      </w:rPr>
-    </w:lvl>
-    <w:lvl w:ilvl="2">
-      <w:start w:val="1"/>
-      <w:numFmt w:val="bullet"/>
-      <w:lvlText w:val="■"/>
-      <w:lvlJc w:val="left"/>
-      <w:pPr>
-        <w:ind w:left="2160" w:hanging="360"/>
-      </w:pPr>
-      <w:rPr>
-        <w:u w:val="none"/>
-      </w:rPr>
-    </w:lvl>
-    <w:lvl w:ilvl="3">
-      <w:start w:val="1"/>
-      <w:numFmt w:val="bullet"/>
-      <w:lvlText w:val="●"/>
-      <w:lvlJc w:val="left"/>
-      <w:pPr>
-        <w:ind w:left="2880" w:hanging="360"/>
-      </w:pPr>
-      <w:rPr>
-        <w:u w:val="none"/>
-      </w:rPr>
-    </w:lvl>
-    <w:lvl w:ilvl="4">
-      <w:start w:val="1"/>
-      <w:numFmt w:val="bullet"/>
-      <w:lvlText w:val="○"/>
-      <w:lvlJc w:val="left"/>
-      <w:pPr>
-        <w:ind w:left="3600" w:hanging="360"/>
-      </w:pPr>
-      <w:rPr>
-        <w:u w:val="none"/>
-      </w:rPr>
-    </w:lvl>
-    <w:lvl w:ilvl="5">
-      <w:start w:val="1"/>
-      <w:numFmt w:val="bullet"/>
-      <w:lvlText w:val="■"/>
-      <w:lvlJc w:val="left"/>
-      <w:pPr>
-        <w:ind w:left="4320" w:hanging="360"/>
-      </w:pPr>
-      <w:rPr>
-        <w:u w:val="none"/>
-      </w:rPr>
-    </w:lvl>
-    <w:lvl w:ilvl="6">
-      <w:start w:val="1"/>
-      <w:numFmt w:val="bullet"/>
-      <w:lvlText w:val="●"/>
-      <w:lvlJc w:val="left"/>
-      <w:pPr>
-        <w:ind w:left="5040" w:hanging="360"/>
-      </w:pPr>
-      <w:rPr>
-        <w:u w:val="none"/>
-      </w:rPr>
-    </w:lvl>
-    <w:lvl w:ilvl="7">
-      <w:start w:val="1"/>
-      <w:numFmt w:val="bullet"/>
-      <w:lvlText w:val="○"/>
-      <w:lvlJc w:val="left"/>
-      <w:pPr>
-        <w:ind w:left="5760" w:hanging="360"/>
-      </w:pPr>
-      <w:rPr>
-        <w:u w:val="none"/>
-      </w:rPr>
-    </w:lvl>
-    <w:lvl w:ilvl="8">
-      <w:start w:val="1"/>
-      <w:numFmt w:val="bullet"/>
-      <w:lvlText w:val="■"/>
-      <w:lvlJc w:val="left"/>
-      <w:pPr>
-        <w:ind w:left="6480" w:hanging="360"/>
-      </w:pPr>
-      <w:rPr>
-        <w:u w:val="none"/>
-      </w:rPr>
-    </w:lvl>
-  </w:abstractNum>
-  <w:abstractNum w:abstractNumId="31">
     <w:lvl w:ilvl="0">
       <w:start w:val="1"/>
       <w:numFmt w:val="bullet"/>
@@ -17749,12 +17431,6 @@
   </w:num>
   <w:num w:numId="29">
     <w:abstractNumId w:val="29"/>
-  </w:num>
-  <w:num w:numId="30">
-    <w:abstractNumId w:val="30"/>
-  </w:num>
-  <w:num w:numId="31">
-    <w:abstractNumId w:val="31"/>
   </w:num>
 </w:numbering>
 </file>
@@ -19401,7 +19077,7 @@
 
 <file path=customXML/item1.xml><?xml version="1.0" encoding="utf-8"?>
 <go:gDocsCustomXmlDataStorage xmlns:go="http://customooxmlschemas.google.com/" xmlns:r="http://schemas.openxmlformats.org/officeDocument/2006/relationships" uri="GoogleDocsCustomDataVersion2">
-  <go:docsCustomData xmlns:go="http://customooxmlschemas.google.com/" roundtripDataSignature="AMtx7mh+kUvZRuBSq74IzfrdBasdd+FqfA==">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</go:docsCustomData>
+  <go:docsCustomData xmlns:go="http://customooxmlschemas.google.com/" roundtripDataSignature="AMtx7mgn3Rr8t8Ac/u9V5R1MP86B5YlA9A==">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</go:docsCustomData>
 </go:gDocsCustomXmlDataStorage>
 </file>
 

</xml_diff>